<commit_message>
Traduction de tous les fichiers .docx dans les langues respectives
</commit_message>
<xml_diff>
--- a/i18n/de/docusaurus-plugin-content-docs/current/contractual/hierarchie.docx
+++ b/i18n/de/docusaurus-plugin-content-docs/current/contractual/hierarchie.docx
@@ -2,41 +2,42 @@
 <file path=word/document.xml><?xml version="1.0" encoding="utf-8"?>
 <w:document xmlns:w="http://schemas.openxmlformats.org/wordprocessingml/2006/main" xmlns:m="http://schemas.openxmlformats.org/officeDocument/2006/math" xmlns:r="http://schemas.openxmlformats.org/officeDocument/2006/relationships" xmlns:o="urn:schemas-microsoft-com:office:office" xmlns:v="urn:schemas-microsoft-com:vml" xmlns:w10="urn:schemas-microsoft-com:office:word" xmlns:a="http://schemas.openxmlformats.org/drawingml/2006/main" xmlns:pic="http://schemas.openxmlformats.org/drawingml/2006/picture" xmlns:wp="http://schemas.openxmlformats.org/drawingml/2006/wordprocessingDrawing">
   <w:body>
-    <w:p>
-      <w:pPr>
-        <w:pStyle w:val="Title"/>
-      </w:pPr>
-      <w:r>
-        <w:t xml:space="preserve">Hiérarchie</w:t>
-      </w:r>
-      <w:r>
-        <w:t xml:space="preserve"> </w:t>
-      </w:r>
-      <w:r>
-        <w:t xml:space="preserve">des</w:t>
-      </w:r>
-      <w:r>
-        <w:t xml:space="preserve"> </w:t>
-      </w:r>
-      <w:r>
-        <w:t xml:space="preserve">documents</w:t>
-      </w:r>
-      <w:r>
-        <w:t xml:space="preserve"> </w:t>
-      </w:r>
-      <w:r>
-        <w:t xml:space="preserve">contractuels</w:t>
-      </w:r>
-    </w:p>
+    <w:sdt>
+      <w:sdtPr>
+        <w:docPartObj>
+          <w:docPartGallery w:val="Table of Contents"/>
+          <w:docPartUnique/>
+        </w:docPartObj>
+      </w:sdtPr>
+      <w:sdtContent>
+        <w:p>
+          <w:pPr>
+            <w:pStyle w:val="TOCHeading"/>
+          </w:pPr>
+          <w:r>
+            <w:t xml:space="preserve">Table of Contents</w:t>
+          </w:r>
+        </w:p>
+        <w:p>
+          <w:r>
+            <w:fldChar w:fldCharType="begin" w:dirty="true"/>
+            <w:instrText xml:space="preserve">TOC \o "1-3" \h \z \u</w:instrText>
+            <w:fldChar w:fldCharType="separate"/>
+            <w:fldChar w:fldCharType="end"/>
+          </w:r>
+        </w:p>
+      </w:sdtContent>
+    </w:sdt>
     <w:tbl>
       <w:tblPr>
         <w:tblStyle w:val="Table"/>
-        <w:tblW w:type="auto" w:w="0"/>
+        <w:tblW w:type="pct" w:w="5000"/>
+        <w:tblLayout w:type="fixed"/>
         <w:tblLook w:firstRow="0" w:lastRow="0" w:firstColumn="0" w:lastColumn="0" w:noHBand="0" w:noVBand="0" w:val="0000"/>
       </w:tblPr>
       <w:tblGrid>
-        <w:gridCol w:w="3960"/>
-        <w:gridCol w:w="3960"/>
+        <w:gridCol w:w="1013"/>
+        <w:gridCol w:w="6906"/>
       </w:tblGrid>
       <w:tr>
         <w:tc>
@@ -47,7 +48,7 @@
               <w:jc w:val="left"/>
             </w:pPr>
             <w:r>
-              <w:t xml:space="preserve">Référence</w:t>
+              <w:t xml:space="preserve">Referenz ct.am.jur.hdc 2.0</w:t>
             </w:r>
           </w:p>
         </w:tc>
@@ -56,11 +57,7 @@
           <w:p>
             <w:pPr>
               <w:pStyle w:val="Compact"/>
-              <w:jc w:val="left"/>
             </w:pPr>
-            <w:r>
-              <w:t xml:space="preserve">CT.AM.JUR.HDC 2.0</w:t>
-            </w:r>
           </w:p>
         </w:tc>
       </w:tr>
@@ -73,7 +70,7 @@
               <w:jc w:val="left"/>
             </w:pPr>
             <w:r>
-              <w:t xml:space="preserve">Date</w:t>
+              <w:t xml:space="preserve">Datum 13. März 2024</w:t>
             </w:r>
           </w:p>
         </w:tc>
@@ -82,11 +79,7 @@
           <w:p>
             <w:pPr>
               <w:pStyle w:val="Compact"/>
-              <w:jc w:val="left"/>
             </w:pPr>
-            <w:r>
-              <w:t xml:space="preserve">13 mars 2024</w:t>
-            </w:r>
           </w:p>
         </w:tc>
       </w:tr>
@@ -96,7 +89,13 @@
         <w:pStyle w:val="BodyText"/>
       </w:pPr>
       <w:r>
-        <w:t xml:space="preserve">La hiérarchie des documents contractuels est établie selon un ordre de priorité défini :</w:t>
+        <w:t xml:space="preserve">Die Hierarchie vertraglicher Dokumente wird in einer Reihenfolge von festgelegt</w:t>
+      </w:r>
+      <w:r>
+        <w:t xml:space="preserve"> </w:t>
+      </w:r>
+      <w:r>
+        <w:t xml:space="preserve">Definierte Priorität:</w:t>
       </w:r>
     </w:p>
     <w:p>
@@ -107,14 +106,9 @@
           <w:numId w:val="1001"/>
         </w:numPr>
       </w:pPr>
-      <w:hyperlink r:id="rId20">
-        <w:r>
-          <w:rPr>
-            <w:rStyle w:val="Hyperlink"/>
-          </w:rPr>
-          <w:t xml:space="preserve">Conditions Générales de Vente et d'Utilisation (CGVU)</w:t>
-        </w:r>
-      </w:hyperlink>
+      <w:r>
+        <w:t xml:space="preserve">[Allgemeine Verkaufs- und Nutzungsbedingungen (CGVU)] (CGVU.DOCX)</w:t>
+      </w:r>
     </w:p>
     <w:p>
       <w:pPr>
@@ -124,14 +118,9 @@
           <w:numId w:val="1001"/>
         </w:numPr>
       </w:pPr>
-      <w:hyperlink r:id="rId21">
-        <w:r>
-          <w:rPr>
-            <w:rStyle w:val="Hyperlink"/>
-          </w:rPr>
-          <w:t xml:space="preserve">Convention de service IaaS</w:t>
-        </w:r>
-      </w:hyperlink>
+      <w:r>
+        <w:t xml:space="preserve">[IaaS -Servicevertrag] (IaaS/SLA_IAAS.DOCX)</w:t>
+      </w:r>
     </w:p>
     <w:p>
       <w:pPr>
@@ -141,19 +130,8 @@
           <w:numId w:val="1001"/>
         </w:numPr>
       </w:pPr>
-      <w:hyperlink r:id="rId22">
-        <w:r>
-          <w:rPr>
-            <w:rStyle w:val="Hyperlink"/>
-          </w:rPr>
-          <w:t xml:space="preserve">Convention de service PaaS</w:t>
-        </w:r>
-      </w:hyperlink>
-      <w:r>
-        <w:t xml:space="preserve"> </w:t>
-      </w:r>
-      <w:r>
-        <w:t xml:space="preserve">(*)</w:t>
+      <w:r>
+        <w:t xml:space="preserve">[PAAS -Servicevereinbarung] (PAAS/SLA_PAAS.DOCX) (*)</w:t>
       </w:r>
     </w:p>
     <w:p>
@@ -165,7 +143,7 @@
         </w:numPr>
       </w:pPr>
       <w:r>
-        <w:t xml:space="preserve">Convention spécifique particulière (**)</w:t>
+        <w:t xml:space="preserve">Besondere Zustimmung (**)</w:t>
       </w:r>
     </w:p>
     <w:p>
@@ -173,7 +151,19 @@
         <w:pStyle w:val="FirstParagraph"/>
       </w:pPr>
       <w:r>
-        <w:t xml:space="preserve">(*) Il est spécifié que la présente Convention de services PaaS est valide uniquement si le CLIENT a signé la Convention concernant les services IaaS SecNumCloud.</w:t>
+        <w:t xml:space="preserve">(*) Es wird angegeben, dass diese PaaS -Servicevereinbarung ist</w:t>
+      </w:r>
+      <w:r>
+        <w:t xml:space="preserve"> </w:t>
+      </w:r>
+      <w:r>
+        <w:t xml:space="preserve">Nur gültig, wenn der Kunde die Vereinbarung über unterzeichnet hat</w:t>
+      </w:r>
+      <w:r>
+        <w:t xml:space="preserve"> </w:t>
+      </w:r>
+      <w:r>
+        <w:t xml:space="preserve">IaaS Secnumcloud Services.</w:t>
       </w:r>
     </w:p>
     <w:p>
@@ -181,7 +171,13 @@
         <w:pStyle w:val="BodyText"/>
       </w:pPr>
       <w:r>
-        <w:t xml:space="preserve">(**) Convention spécifique, conçue pour s'aligner sur les particularités du projet.</w:t>
+        <w:t xml:space="preserve">(**) Spezifische Vereinbarung, die sich an der ausrichten soll</w:t>
+      </w:r>
+      <w:r>
+        <w:t xml:space="preserve"> </w:t>
+      </w:r>
+      <w:r>
+        <w:t xml:space="preserve">Besonderheiten des Projekts.</w:t>
       </w:r>
     </w:p>
     <w:p>
@@ -193,10 +189,28 @@
           <w:i/>
           <w:iCs/>
         </w:rPr>
-        <w:t xml:space="preserve">Note : Les versions traduites en anglais, italien, allemand et espagnol sont fournies uniquement pour faciliter la compréhension de l'offre.</w:t>
+        <w:t xml:space="preserve">Hinweis: Die Versionen, die in Englisch, Italienisch, Deutsch und Spanisch übersetzt wurden</w:t>
+      </w:r>
+      <w:r>
+        <w:rPr>
+          <w:i/>
+          <w:iCs/>
+        </w:rPr>
+        <w:t xml:space="preserve"> </w:t>
+      </w:r>
+      <w:r>
+        <w:rPr>
+          <w:i/>
+          <w:iCs/>
+        </w:rPr>
+        <w:t xml:space="preserve">werden nur bereitgestellt, um das Verständnis des Angebots zu erleichtern.</w:t>
       </w:r>
     </w:p>
-    <w:sectPr/>
+    <w:sectPr>
+      <w:footnotePr>
+        <w:numRestart w:val="eachSect"/>
+      </w:footnotePr>
+    </w:sectPr>
   </w:body>
 </w:document>
 </file>
@@ -234,7 +248,7 @@
       <w:lvlText w:val=" "/>
       <w:lvlJc w:val="left"/>
       <w:pPr>
-        <w:ind w:left="720" w:hanging="480"/>
+        <w:ind w:left="720" w:hanging="360"/>
       </w:pPr>
     </w:lvl>
     <w:lvl w:ilvl="1">
@@ -242,7 +256,7 @@
       <w:lvlText w:val=" "/>
       <w:lvlJc w:val="left"/>
       <w:pPr>
-        <w:ind w:left="1440" w:hanging="480"/>
+        <w:ind w:left="1440" w:hanging="360"/>
       </w:pPr>
     </w:lvl>
     <w:lvl w:ilvl="2">
@@ -250,7 +264,7 @@
       <w:lvlText w:val=" "/>
       <w:lvlJc w:val="left"/>
       <w:pPr>
-        <w:ind w:left="2160" w:hanging="480"/>
+        <w:ind w:left="2160" w:hanging="360"/>
       </w:pPr>
     </w:lvl>
     <w:lvl w:ilvl="3">
@@ -258,7 +272,7 @@
       <w:lvlText w:val=" "/>
       <w:lvlJc w:val="left"/>
       <w:pPr>
-        <w:ind w:left="2880" w:hanging="480"/>
+        <w:ind w:left="2880" w:hanging="360"/>
       </w:pPr>
     </w:lvl>
     <w:lvl w:ilvl="4">
@@ -266,7 +280,7 @@
       <w:lvlText w:val=" "/>
       <w:lvlJc w:val="left"/>
       <w:pPr>
-        <w:ind w:left="3600" w:hanging="480"/>
+        <w:ind w:left="3600" w:hanging="360"/>
       </w:pPr>
     </w:lvl>
     <w:lvl w:ilvl="5">
@@ -274,7 +288,7 @@
       <w:lvlText w:val=" "/>
       <w:lvlJc w:val="left"/>
       <w:pPr>
-        <w:ind w:left="4320" w:hanging="480"/>
+        <w:ind w:left="4320" w:hanging="360"/>
       </w:pPr>
     </w:lvl>
     <w:lvl w:ilvl="6">
@@ -282,7 +296,7 @@
       <w:lvlText w:val=" "/>
       <w:lvlJc w:val="left"/>
       <w:pPr>
-        <w:ind w:left="5040" w:hanging="480"/>
+        <w:ind w:left="5040" w:hanging="360"/>
       </w:pPr>
     </w:lvl>
     <w:lvl w:ilvl="7">
@@ -290,7 +304,7 @@
       <w:lvlText w:val=" "/>
       <w:lvlJc w:val="left"/>
       <w:pPr>
-        <w:ind w:left="5760" w:hanging="480"/>
+        <w:ind w:left="5760" w:hanging="360"/>
       </w:pPr>
     </w:lvl>
     <w:lvl w:ilvl="8">
@@ -298,7 +312,7 @@
       <w:lvlText w:val=" "/>
       <w:lvlJc w:val="left"/>
       <w:pPr>
-        <w:ind w:left="6480" w:hanging="480"/>
+        <w:ind w:left="6480" w:hanging="360"/>
       </w:pPr>
     </w:lvl>
   </w:abstractNum>
@@ -311,7 +325,7 @@
       <w:lvlText w:val="%1."/>
       <w:lvlJc w:val="left"/>
       <w:pPr>
-        <w:ind w:left="720" w:hanging="480"/>
+        <w:ind w:left="720" w:hanging="360"/>
       </w:pPr>
     </w:lvl>
     <w:lvl w:ilvl="1">
@@ -320,7 +334,7 @@
       <w:lvlText w:val="%2."/>
       <w:lvlJc w:val="left"/>
       <w:pPr>
-        <w:ind w:left="1440" w:hanging="480"/>
+        <w:ind w:left="1440" w:hanging="360"/>
       </w:pPr>
     </w:lvl>
     <w:lvl w:ilvl="2">
@@ -329,7 +343,7 @@
       <w:lvlText w:val="%3."/>
       <w:lvlJc w:val="left"/>
       <w:pPr>
-        <w:ind w:left="2160" w:hanging="480"/>
+        <w:ind w:left="2160" w:hanging="360"/>
       </w:pPr>
     </w:lvl>
     <w:lvl w:ilvl="3">
@@ -338,7 +352,7 @@
       <w:lvlText w:val="%4."/>
       <w:lvlJc w:val="left"/>
       <w:pPr>
-        <w:ind w:left="2880" w:hanging="480"/>
+        <w:ind w:left="2880" w:hanging="360"/>
       </w:pPr>
     </w:lvl>
     <w:lvl w:ilvl="4">
@@ -347,7 +361,7 @@
       <w:lvlText w:val="%5."/>
       <w:lvlJc w:val="left"/>
       <w:pPr>
-        <w:ind w:left="3600" w:hanging="480"/>
+        <w:ind w:left="3600" w:hanging="360"/>
       </w:pPr>
     </w:lvl>
     <w:lvl w:ilvl="5">
@@ -356,7 +370,7 @@
       <w:lvlText w:val="%6."/>
       <w:lvlJc w:val="left"/>
       <w:pPr>
-        <w:ind w:left="4320" w:hanging="480"/>
+        <w:ind w:left="4320" w:hanging="360"/>
       </w:pPr>
     </w:lvl>
     <w:lvl w:ilvl="6">
@@ -365,7 +379,7 @@
       <w:lvlText w:val="%7."/>
       <w:lvlJc w:val="left"/>
       <w:pPr>
-        <w:ind w:left="5040" w:hanging="480"/>
+        <w:ind w:left="5040" w:hanging="360"/>
       </w:pPr>
     </w:lvl>
     <w:lvl w:ilvl="7">
@@ -374,7 +388,7 @@
       <w:lvlText w:val="%8."/>
       <w:lvlJc w:val="left"/>
       <w:pPr>
-        <w:ind w:left="5760" w:hanging="480"/>
+        <w:ind w:left="5760" w:hanging="360"/>
       </w:pPr>
     </w:lvl>
     <w:lvl w:ilvl="8">
@@ -383,7 +397,7 @@
       <w:lvlText w:val="%9."/>
       <w:lvlJc w:val="left"/>
       <w:pPr>
-        <w:ind w:left="6480" w:hanging="480"/>
+        <w:ind w:left="6480" w:hanging="360"/>
       </w:pPr>
     </w:lvl>
   </w:abstractNum>
@@ -472,57 +486,94 @@
     <w:name w:val="Title"/>
     <w:basedOn w:val="Normal"/>
     <w:next w:val="BodyText"/>
-    <w:qFormat/>
-    <w:pPr>
-      <w:keepNext/>
-      <w:keepLines/>
-      <w:spacing w:after="240" w:before="480"/>
+    <w:link w:val="TitleChar"/>
+    <w:uiPriority w:val="10"/>
+    <w:qFormat/>
+    <w:rsid w:val="00A10FD9"/>
+    <w:pPr>
+      <w:spacing w:after="80" w:line="240" w:lineRule="auto"/>
+      <w:contextualSpacing/>
       <w:jc w:val="center"/>
     </w:pPr>
     <w:rPr>
       <w:rFonts w:asciiTheme="majorHAnsi" w:cstheme="majorBidi" w:eastAsiaTheme="majorEastAsia" w:hAnsiTheme="majorHAnsi"/>
-      <w:b/>
-      <w:bCs/>
-      <w:color w:themeColor="accent1" w:themeShade="B5" w:val="345A8A"/>
-      <w:sz w:val="36"/>
-      <w:szCs w:val="36"/>
+      <w:sz w:val="56"/>
+      <w:szCs w:val="56"/>
+    </w:rPr>
+  </w:style>
+  <w:style w:customStyle="1" w:styleId="TitleChar" w:type="character">
+    <w:name w:val="Title Char"/>
+    <w:basedOn w:val="DefaultParagraphFont"/>
+    <w:link w:val="Title"/>
+    <w:uiPriority w:val="10"/>
+    <w:rsid w:val="00A10FD9"/>
+    <w:rPr>
+      <w:rFonts w:asciiTheme="majorHAnsi" w:cstheme="majorBidi" w:eastAsiaTheme="majorEastAsia" w:hAnsiTheme="majorHAnsi"/>
+      <w:sz w:val="56"/>
+      <w:szCs w:val="56"/>
     </w:rPr>
   </w:style>
   <w:style w:styleId="Subtitle" w:type="paragraph">
     <w:name w:val="Subtitle"/>
     <w:basedOn w:val="Title"/>
     <w:next w:val="BodyText"/>
+    <w:link w:val="SubtitleChar"/>
+    <w:uiPriority w:val="11"/>
+    <w:qFormat/>
+    <w:rsid w:val="00A10FD9"/>
+    <w:pPr>
+      <w:numPr>
+        <w:ilvl w:val="1"/>
+      </w:numPr>
+    </w:pPr>
+    <w:rPr>
+      <w:rFonts w:cstheme="majorBidi" w:eastAsiaTheme="majorEastAsia"/>
+      <w:spacing w:val="15"/>
+      <w:sz w:val="28"/>
+      <w:szCs w:val="28"/>
+    </w:rPr>
+  </w:style>
+  <w:style w:customStyle="1" w:styleId="SubtitleChar" w:type="character">
+    <w:name w:val="Subtitle Char"/>
+    <w:basedOn w:val="DefaultParagraphFont"/>
+    <w:link w:val="Subtitle"/>
+    <w:uiPriority w:val="11"/>
+    <w:rsid w:val="00A10FD9"/>
+    <w:rPr>
+      <w:rFonts w:cstheme="majorBidi" w:eastAsiaTheme="majorEastAsia"/>
+      <w:color w:themeColor="text1" w:themeTint="A6" w:val="595959"/>
+      <w:spacing w:val="15"/>
+      <w:sz w:val="28"/>
+      <w:szCs w:val="28"/>
+    </w:rPr>
+  </w:style>
+  <w:style w:customStyle="1" w:styleId="Author" w:type="paragraph">
+    <w:name w:val="Author"/>
+    <w:basedOn w:val="Title"/>
+    <w:next w:val="BodyText"/>
     <w:qFormat/>
     <w:pPr>
       <w:keepNext/>
       <w:keepLines/>
-      <w:spacing w:after="240" w:before="240"/>
-      <w:jc w:val="center"/>
-    </w:pPr>
-    <w:rPr>
-      <w:sz w:val="30"/>
-      <w:szCs w:val="30"/>
-    </w:rPr>
-  </w:style>
-  <w:style w:customStyle="1" w:styleId="Author" w:type="paragraph">
-    <w:name w:val="Author"/>
+    </w:pPr>
+    <w:rPr>
+      <w:sz w:val="24"/>
+      <w:szCs w:val="24"/>
+    </w:rPr>
+  </w:style>
+  <w:style w:styleId="Date" w:type="paragraph">
+    <w:name w:val="Date"/>
+    <w:basedOn w:val="Title"/>
     <w:next w:val="BodyText"/>
     <w:qFormat/>
     <w:pPr>
       <w:keepNext/>
       <w:keepLines/>
-      <w:jc w:val="center"/>
-    </w:pPr>
-  </w:style>
-  <w:style w:styleId="Date" w:type="paragraph">
-    <w:name w:val="Date"/>
-    <w:next w:val="BodyText"/>
-    <w:qFormat/>
-    <w:pPr>
-      <w:keepNext/>
-      <w:keepLines/>
-      <w:jc w:val="center"/>
-    </w:pPr>
+    </w:pPr>
+    <w:rPr>
+      <w:sz w:val="24"/>
+      <w:szCs w:val="24"/>
+    </w:rPr>
   </w:style>
   <w:style w:customStyle="1" w:styleId="AbstractTitle" w:type="paragraph">
     <w:name w:val="Abstract Title"/>
@@ -537,7 +588,6 @@
     </w:pPr>
     <w:rPr>
       <w:b/>
-      <w:color w:val="345A8A"/>
       <w:sz w:val="20"/>
       <w:szCs w:val="20"/>
     </w:rPr>
@@ -566,191 +616,321 @@
     <w:rPr/>
   </w:style>
   <w:style w:styleId="Heading1" w:type="paragraph">
-    <w:name w:val="Heading 1"/>
+    <w:name w:val="heading 1"/>
     <w:basedOn w:val="Normal"/>
     <w:next w:val="BodyText"/>
-    <w:uiPriority w:val="9"/>
-    <w:qFormat/>
+    <w:link w:val="Heading1Char"/>
+    <w:uiPriority w:val="9"/>
+    <w:qFormat/>
+    <w:rsid w:val="00A10FD9"/>
     <w:pPr>
       <w:keepNext/>
       <w:keepLines/>
-      <w:spacing w:after="0" w:before="480"/>
+      <w:spacing w:after="80" w:before="360"/>
       <w:outlineLvl w:val="0"/>
     </w:pPr>
     <w:rPr>
       <w:rFonts w:asciiTheme="majorHAnsi" w:cstheme="majorBidi" w:eastAsiaTheme="majorEastAsia" w:hAnsiTheme="majorHAnsi"/>
-      <w:b/>
-      <w:bCs/>
-      <w:color w:themeColor="accent1" w:val="4F81BD"/>
+      <w:color w:themeColor="accent1" w:themeShade="BF" w:val="0F4761"/>
+      <w:sz w:val="40"/>
+      <w:szCs w:val="40"/>
+    </w:rPr>
+  </w:style>
+  <w:style w:styleId="Heading2" w:type="paragraph">
+    <w:name w:val="heading 2"/>
+    <w:basedOn w:val="Normal"/>
+    <w:next w:val="BodyText"/>
+    <w:link w:val="Heading2Char"/>
+    <w:uiPriority w:val="9"/>
+    <w:semiHidden/>
+    <w:unhideWhenUsed/>
+    <w:qFormat/>
+    <w:rsid w:val="00A10FD9"/>
+    <w:pPr>
+      <w:keepNext/>
+      <w:keepLines/>
+      <w:spacing w:after="80" w:before="160"/>
+      <w:outlineLvl w:val="1"/>
+    </w:pPr>
+    <w:rPr>
+      <w:rFonts w:asciiTheme="majorHAnsi" w:cstheme="majorBidi" w:eastAsiaTheme="majorEastAsia" w:hAnsiTheme="majorHAnsi"/>
+      <w:color w:themeColor="accent1" w:themeShade="BF" w:val="0F4761"/>
       <w:sz w:val="32"/>
       <w:szCs w:val="32"/>
     </w:rPr>
   </w:style>
-  <w:style w:styleId="Heading2" w:type="paragraph">
-    <w:name w:val="Heading 2"/>
+  <w:style w:styleId="Heading3" w:type="paragraph">
+    <w:name w:val="heading 3"/>
     <w:basedOn w:val="Normal"/>
     <w:next w:val="BodyText"/>
-    <w:uiPriority w:val="9"/>
+    <w:link w:val="Heading3Char"/>
+    <w:uiPriority w:val="9"/>
+    <w:semiHidden/>
     <w:unhideWhenUsed/>
     <w:qFormat/>
+    <w:rsid w:val="00A10FD9"/>
     <w:pPr>
       <w:keepNext/>
       <w:keepLines/>
-      <w:spacing w:after="0" w:before="200"/>
-      <w:outlineLvl w:val="1"/>
-    </w:pPr>
-    <w:rPr>
-      <w:rFonts w:asciiTheme="majorHAnsi" w:cstheme="majorBidi" w:eastAsiaTheme="majorEastAsia" w:hAnsiTheme="majorHAnsi"/>
-      <w:b/>
-      <w:bCs/>
-      <w:color w:themeColor="accent1" w:val="4F81BD"/>
+      <w:spacing w:after="80" w:before="160"/>
+      <w:outlineLvl w:val="2"/>
+    </w:pPr>
+    <w:rPr>
+      <w:rFonts w:cstheme="majorBidi" w:eastAsiaTheme="majorEastAsia"/>
+      <w:color w:themeColor="accent1" w:themeShade="BF" w:val="0F4761"/>
       <w:sz w:val="28"/>
       <w:szCs w:val="28"/>
     </w:rPr>
   </w:style>
-  <w:style w:styleId="Heading3" w:type="paragraph">
-    <w:name w:val="Heading 3"/>
+  <w:style w:styleId="Heading4" w:type="paragraph">
+    <w:name w:val="heading 4"/>
     <w:basedOn w:val="Normal"/>
     <w:next w:val="BodyText"/>
-    <w:uiPriority w:val="9"/>
+    <w:link w:val="Heading4Char"/>
+    <w:uiPriority w:val="9"/>
+    <w:semiHidden/>
     <w:unhideWhenUsed/>
     <w:qFormat/>
+    <w:rsid w:val="00A10FD9"/>
     <w:pPr>
       <w:keepNext/>
       <w:keepLines/>
-      <w:spacing w:after="0" w:before="200"/>
-      <w:outlineLvl w:val="2"/>
-    </w:pPr>
-    <w:rPr>
-      <w:rFonts w:asciiTheme="majorHAnsi" w:cstheme="majorBidi" w:eastAsiaTheme="majorEastAsia" w:hAnsiTheme="majorHAnsi"/>
-      <w:b/>
-      <w:bCs/>
-      <w:color w:themeColor="accent1" w:val="4F81BD"/>
-      <w:sz w:val="24"/>
-      <w:szCs w:val="24"/>
-    </w:rPr>
-  </w:style>
-  <w:style w:styleId="Heading4" w:type="paragraph">
-    <w:name w:val="Heading 4"/>
+      <w:spacing w:after="40" w:before="80"/>
+      <w:outlineLvl w:val="3"/>
+    </w:pPr>
+    <w:rPr>
+      <w:rFonts w:cstheme="majorBidi" w:eastAsiaTheme="majorEastAsia"/>
+      <w:i/>
+      <w:iCs/>
+      <w:color w:themeColor="accent1" w:themeShade="BF" w:val="0F4761"/>
+    </w:rPr>
+  </w:style>
+  <w:style w:styleId="Heading5" w:type="paragraph">
+    <w:name w:val="heading 5"/>
     <w:basedOn w:val="Normal"/>
     <w:next w:val="BodyText"/>
-    <w:uiPriority w:val="9"/>
+    <w:link w:val="Heading5Char"/>
+    <w:uiPriority w:val="9"/>
+    <w:semiHidden/>
     <w:unhideWhenUsed/>
     <w:qFormat/>
+    <w:rsid w:val="00A10FD9"/>
     <w:pPr>
       <w:keepNext/>
       <w:keepLines/>
-      <w:spacing w:after="0" w:before="200"/>
-      <w:outlineLvl w:val="3"/>
-    </w:pPr>
-    <w:rPr>
-      <w:rFonts w:asciiTheme="majorHAnsi" w:cstheme="majorBidi" w:eastAsiaTheme="majorEastAsia" w:hAnsiTheme="majorHAnsi"/>
-      <w:bCs/>
-      <w:i/>
-      <w:color w:themeColor="accent1" w:val="4F81BD"/>
-      <w:sz w:val="24"/>
-      <w:szCs w:val="24"/>
-    </w:rPr>
-  </w:style>
-  <w:style w:styleId="Heading5" w:type="paragraph">
-    <w:name w:val="Heading 5"/>
+      <w:spacing w:after="40" w:before="80"/>
+      <w:outlineLvl w:val="4"/>
+    </w:pPr>
+    <w:rPr>
+      <w:rFonts w:cstheme="majorBidi" w:eastAsiaTheme="majorEastAsia"/>
+      <w:color w:themeColor="accent1" w:themeShade="BF" w:val="0F4761"/>
+    </w:rPr>
+  </w:style>
+  <w:style w:styleId="Heading6" w:type="paragraph">
+    <w:name w:val="heading 6"/>
     <w:basedOn w:val="Normal"/>
     <w:next w:val="BodyText"/>
-    <w:uiPriority w:val="9"/>
+    <w:link w:val="Heading6Char"/>
+    <w:uiPriority w:val="9"/>
+    <w:semiHidden/>
     <w:unhideWhenUsed/>
     <w:qFormat/>
+    <w:rsid w:val="00A10FD9"/>
     <w:pPr>
       <w:keepNext/>
       <w:keepLines/>
-      <w:spacing w:after="0" w:before="200"/>
-      <w:outlineLvl w:val="4"/>
-    </w:pPr>
-    <w:rPr>
-      <w:rFonts w:asciiTheme="majorHAnsi" w:cstheme="majorBidi" w:eastAsiaTheme="majorEastAsia" w:hAnsiTheme="majorHAnsi"/>
+      <w:spacing w:after="0" w:before="40"/>
+      <w:outlineLvl w:val="5"/>
+    </w:pPr>
+    <w:rPr>
+      <w:rFonts w:cstheme="majorBidi" w:eastAsiaTheme="majorEastAsia"/>
+      <w:i/>
       <w:iCs/>
-      <w:color w:themeColor="accent1" w:val="4F81BD"/>
-      <w:sz w:val="24"/>
-      <w:szCs w:val="24"/>
-    </w:rPr>
-  </w:style>
-  <w:style w:styleId="Heading6" w:type="paragraph">
-    <w:name w:val="Heading 6"/>
+      <w:color w:themeColor="text1" w:themeTint="A6" w:val="595959"/>
+    </w:rPr>
+  </w:style>
+  <w:style w:styleId="Heading7" w:type="paragraph">
+    <w:name w:val="heading 7"/>
     <w:basedOn w:val="Normal"/>
     <w:next w:val="BodyText"/>
-    <w:uiPriority w:val="9"/>
+    <w:link w:val="Heading7Char"/>
+    <w:uiPriority w:val="9"/>
+    <w:semiHidden/>
     <w:unhideWhenUsed/>
     <w:qFormat/>
+    <w:rsid w:val="00A10FD9"/>
     <w:pPr>
       <w:keepNext/>
       <w:keepLines/>
-      <w:spacing w:after="0" w:before="200"/>
-      <w:outlineLvl w:val="5"/>
-    </w:pPr>
-    <w:rPr>
-      <w:rFonts w:asciiTheme="majorHAnsi" w:cstheme="majorBidi" w:eastAsiaTheme="majorEastAsia" w:hAnsiTheme="majorHAnsi"/>
-      <w:color w:themeColor="accent1" w:val="4F81BD"/>
-      <w:sz w:val="24"/>
-      <w:szCs w:val="24"/>
-    </w:rPr>
-  </w:style>
-  <w:style w:styleId="Heading7" w:type="paragraph">
-    <w:name w:val="Heading 7"/>
+      <w:spacing w:after="0" w:before="40"/>
+      <w:outlineLvl w:val="6"/>
+    </w:pPr>
+    <w:rPr>
+      <w:rFonts w:cstheme="majorBidi" w:eastAsiaTheme="majorEastAsia"/>
+      <w:color w:themeColor="text1" w:themeTint="A6" w:val="595959"/>
+    </w:rPr>
+  </w:style>
+  <w:style w:styleId="Heading8" w:type="paragraph">
+    <w:name w:val="heading 8"/>
     <w:basedOn w:val="Normal"/>
     <w:next w:val="BodyText"/>
-    <w:uiPriority w:val="9"/>
+    <w:link w:val="Heading8Char"/>
+    <w:uiPriority w:val="9"/>
+    <w:semiHidden/>
     <w:unhideWhenUsed/>
     <w:qFormat/>
+    <w:rsid w:val="00A10FD9"/>
     <w:pPr>
       <w:keepNext/>
       <w:keepLines/>
-      <w:spacing w:after="0" w:before="200"/>
-      <w:outlineLvl w:val="6"/>
-    </w:pPr>
-    <w:rPr>
-      <w:rFonts w:asciiTheme="majorHAnsi" w:cstheme="majorBidi" w:eastAsiaTheme="majorEastAsia" w:hAnsiTheme="majorHAnsi"/>
-      <w:color w:themeColor="accent1" w:val="4F81BD"/>
-      <w:sz w:val="24"/>
-      <w:szCs w:val="24"/>
-    </w:rPr>
-  </w:style>
-  <w:style w:styleId="Heading8" w:type="paragraph">
-    <w:name w:val="Heading 8"/>
+      <w:spacing w:after="0"/>
+      <w:outlineLvl w:val="7"/>
+    </w:pPr>
+    <w:rPr>
+      <w:rFonts w:cstheme="majorBidi" w:eastAsiaTheme="majorEastAsia"/>
+      <w:i/>
+      <w:iCs/>
+      <w:color w:themeColor="text1" w:themeTint="D8" w:val="272727"/>
+    </w:rPr>
+  </w:style>
+  <w:style w:styleId="Heading9" w:type="paragraph">
+    <w:name w:val="heading 9"/>
     <w:basedOn w:val="Normal"/>
     <w:next w:val="BodyText"/>
-    <w:uiPriority w:val="9"/>
+    <w:link w:val="Heading9Char"/>
+    <w:uiPriority w:val="9"/>
+    <w:semiHidden/>
     <w:unhideWhenUsed/>
     <w:qFormat/>
+    <w:rsid w:val="00A10FD9"/>
     <w:pPr>
       <w:keepNext/>
       <w:keepLines/>
-      <w:spacing w:after="0" w:before="200"/>
-      <w:outlineLvl w:val="7"/>
-    </w:pPr>
+      <w:spacing w:after="0"/>
+      <w:outlineLvl w:val="8"/>
+    </w:pPr>
+    <w:rPr>
+      <w:rFonts w:cstheme="majorBidi" w:eastAsiaTheme="majorEastAsia"/>
+      <w:color w:themeColor="text1" w:themeTint="D8" w:val="272727"/>
+    </w:rPr>
+  </w:style>
+  <w:style w:customStyle="1" w:styleId="Heading1Char" w:type="character">
+    <w:name w:val="Heading 1 Char"/>
+    <w:basedOn w:val="DefaultParagraphFont"/>
+    <w:link w:val="Heading1"/>
+    <w:uiPriority w:val="9"/>
+    <w:rsid w:val="00A10FD9"/>
     <w:rPr>
       <w:rFonts w:asciiTheme="majorHAnsi" w:cstheme="majorBidi" w:eastAsiaTheme="majorEastAsia" w:hAnsiTheme="majorHAnsi"/>
-      <w:color w:themeColor="accent1" w:val="4F81BD"/>
-      <w:sz w:val="24"/>
-      <w:szCs w:val="24"/>
-    </w:rPr>
-  </w:style>
-  <w:style w:styleId="Heading9" w:type="paragraph">
-    <w:name w:val="Heading 9"/>
-    <w:basedOn w:val="Normal"/>
-    <w:next w:val="BodyText"/>
-    <w:uiPriority w:val="9"/>
-    <w:unhideWhenUsed/>
-    <w:qFormat/>
-    <w:pPr>
-      <w:keepNext/>
-      <w:keepLines/>
-      <w:spacing w:after="0" w:before="200"/>
-      <w:outlineLvl w:val="8"/>
-    </w:pPr>
+      <w:color w:themeColor="accent1" w:themeShade="BF" w:val="0F4761"/>
+      <w:sz w:val="40"/>
+      <w:szCs w:val="40"/>
+    </w:rPr>
+  </w:style>
+  <w:style w:customStyle="1" w:styleId="Heading2Char" w:type="character">
+    <w:name w:val="Heading 2 Char"/>
+    <w:basedOn w:val="DefaultParagraphFont"/>
+    <w:link w:val="Heading2"/>
+    <w:uiPriority w:val="9"/>
+    <w:semiHidden/>
+    <w:rsid w:val="00A10FD9"/>
     <w:rPr>
       <w:rFonts w:asciiTheme="majorHAnsi" w:cstheme="majorBidi" w:eastAsiaTheme="majorEastAsia" w:hAnsiTheme="majorHAnsi"/>
-      <w:color w:themeColor="accent1" w:val="4F81BD"/>
-      <w:sz w:val="24"/>
-      <w:szCs w:val="24"/>
+      <w:color w:themeColor="accent1" w:themeShade="BF" w:val="0F4761"/>
+      <w:sz w:val="32"/>
+      <w:szCs w:val="32"/>
+    </w:rPr>
+  </w:style>
+  <w:style w:customStyle="1" w:styleId="Heading3Char" w:type="character">
+    <w:name w:val="Heading 3 Char"/>
+    <w:basedOn w:val="DefaultParagraphFont"/>
+    <w:link w:val="Heading3"/>
+    <w:uiPriority w:val="9"/>
+    <w:semiHidden/>
+    <w:rsid w:val="00A10FD9"/>
+    <w:rPr>
+      <w:rFonts w:cstheme="majorBidi" w:eastAsiaTheme="majorEastAsia"/>
+      <w:color w:themeColor="accent1" w:themeShade="BF" w:val="0F4761"/>
+      <w:sz w:val="28"/>
+      <w:szCs w:val="28"/>
+    </w:rPr>
+  </w:style>
+  <w:style w:customStyle="1" w:styleId="Heading4Char" w:type="character">
+    <w:name w:val="Heading 4 Char"/>
+    <w:basedOn w:val="DefaultParagraphFont"/>
+    <w:link w:val="Heading4"/>
+    <w:uiPriority w:val="9"/>
+    <w:semiHidden/>
+    <w:rsid w:val="00A10FD9"/>
+    <w:rPr>
+      <w:rFonts w:cstheme="majorBidi" w:eastAsiaTheme="majorEastAsia"/>
+      <w:i/>
+      <w:iCs/>
+      <w:color w:themeColor="accent1" w:themeShade="BF" w:val="0F4761"/>
+    </w:rPr>
+  </w:style>
+  <w:style w:customStyle="1" w:styleId="Heading5Char" w:type="character">
+    <w:name w:val="Heading 5 Char"/>
+    <w:basedOn w:val="DefaultParagraphFont"/>
+    <w:link w:val="Heading5"/>
+    <w:uiPriority w:val="9"/>
+    <w:semiHidden/>
+    <w:rsid w:val="00A10FD9"/>
+    <w:rPr>
+      <w:rFonts w:cstheme="majorBidi" w:eastAsiaTheme="majorEastAsia"/>
+      <w:color w:themeColor="accent1" w:themeShade="BF" w:val="0F4761"/>
+    </w:rPr>
+  </w:style>
+  <w:style w:customStyle="1" w:styleId="Heading6Char" w:type="character">
+    <w:name w:val="Heading 6 Char"/>
+    <w:basedOn w:val="DefaultParagraphFont"/>
+    <w:link w:val="Heading6"/>
+    <w:uiPriority w:val="9"/>
+    <w:semiHidden/>
+    <w:rsid w:val="00A10FD9"/>
+    <w:rPr>
+      <w:rFonts w:cstheme="majorBidi" w:eastAsiaTheme="majorEastAsia"/>
+      <w:i/>
+      <w:iCs/>
+      <w:color w:themeColor="text1" w:themeTint="A6" w:val="595959"/>
+    </w:rPr>
+  </w:style>
+  <w:style w:customStyle="1" w:styleId="Heading7Char" w:type="character">
+    <w:name w:val="Heading 7 Char"/>
+    <w:basedOn w:val="DefaultParagraphFont"/>
+    <w:link w:val="Heading7"/>
+    <w:uiPriority w:val="9"/>
+    <w:semiHidden/>
+    <w:rsid w:val="00A10FD9"/>
+    <w:rPr>
+      <w:rFonts w:cstheme="majorBidi" w:eastAsiaTheme="majorEastAsia"/>
+      <w:color w:themeColor="text1" w:themeTint="A6" w:val="595959"/>
+    </w:rPr>
+  </w:style>
+  <w:style w:customStyle="1" w:styleId="Heading8Char" w:type="character">
+    <w:name w:val="Heading 8 Char"/>
+    <w:basedOn w:val="DefaultParagraphFont"/>
+    <w:link w:val="Heading8"/>
+    <w:uiPriority w:val="9"/>
+    <w:semiHidden/>
+    <w:rsid w:val="00A10FD9"/>
+    <w:rPr>
+      <w:rFonts w:cstheme="majorBidi" w:eastAsiaTheme="majorEastAsia"/>
+      <w:i/>
+      <w:iCs/>
+      <w:color w:themeColor="text1" w:themeTint="D8" w:val="272727"/>
+    </w:rPr>
+  </w:style>
+  <w:style w:customStyle="1" w:styleId="Heading9Char" w:type="character">
+    <w:name w:val="Heading 9 Char"/>
+    <w:basedOn w:val="DefaultParagraphFont"/>
+    <w:link w:val="Heading9"/>
+    <w:uiPriority w:val="9"/>
+    <w:semiHidden/>
+    <w:rsid w:val="00A10FD9"/>
+    <w:rPr>
+      <w:rFonts w:cstheme="majorBidi" w:eastAsiaTheme="majorEastAsia"/>
+      <w:color w:themeColor="text1" w:themeTint="D8" w:val="272727"/>
     </w:rPr>
   </w:style>
   <w:style w:styleId="BlockText" w:type="paragraph">
@@ -775,8 +955,8 @@
   </w:style>
   <w:style w:styleId="FootnoteBlockText" w:type="paragraph">
     <w:name w:val="Footnote Block Text"/>
-    <w:basedOn w:val="Footnote Text"/>
-    <w:next w:val="Footnote Text"/>
+    <w:basedOn w:val="FootnoteText"/>
+    <w:next w:val="FootnoteText"/>
     <w:uiPriority w:val="9"/>
     <w:unhideWhenUsed/>
     <w:qFormat/>
@@ -1168,44 +1348,44 @@
         <a:sysClr val="window" lastClr="FFFFFF"/>
       </a:lt1>
       <a:dk2>
-        <a:srgbClr val="1F497D"/>
+        <a:srgbClr val="0E2841"/>
       </a:dk2>
       <a:lt2>
-        <a:srgbClr val="EEECE1"/>
+        <a:srgbClr val="E8E8E8"/>
       </a:lt2>
       <a:accent1>
-        <a:srgbClr val="4F81BD"/>
+        <a:srgbClr val="156082"/>
       </a:accent1>
       <a:accent2>
-        <a:srgbClr val="C0504D"/>
+        <a:srgbClr val="E97132"/>
       </a:accent2>
       <a:accent3>
-        <a:srgbClr val="9BBB59"/>
+        <a:srgbClr val="196B24"/>
       </a:accent3>
       <a:accent4>
-        <a:srgbClr val="8064A2"/>
+        <a:srgbClr val="0F9ED5"/>
       </a:accent4>
       <a:accent5>
-        <a:srgbClr val="4BACC6"/>
+        <a:srgbClr val="A02B93"/>
       </a:accent5>
       <a:accent6>
-        <a:srgbClr val="F79646"/>
+        <a:srgbClr val="4EA72E"/>
       </a:accent6>
       <a:hlink>
-        <a:srgbClr val="0000FF"/>
+        <a:srgbClr val="467886"/>
       </a:hlink>
       <a:folHlink>
-        <a:srgbClr val="800080"/>
+        <a:srgbClr val="96607D"/>
       </a:folHlink>
     </a:clrScheme>
     <a:fontScheme name="Office">
       <a:majorFont>
-        <a:latin typeface="Calibri"/>
+        <a:latin typeface="Aptos Display" panose="02110004020202020204"/>
         <a:ea typeface=""/>
         <a:cs typeface=""/>
-        <a:font script="Jpan" typeface="ＭＳ ゴシック"/>
+        <a:font script="Jpan" typeface="游ゴシック Light"/>
         <a:font script="Hang" typeface="맑은 고딕"/>
-        <a:font script="Hans" typeface="宋体"/>
+        <a:font script="Hans" typeface="等线 Light"/>
         <a:font script="Hant" typeface="新細明體"/>
         <a:font script="Arab" typeface="Times New Roman"/>
         <a:font script="Hebr" typeface="Times New Roman"/>
@@ -1232,14 +1412,32 @@
         <a:font script="Mong" typeface="Mongolian Baiti"/>
         <a:font script="Viet" typeface="Times New Roman"/>
         <a:font script="Uigh" typeface="Microsoft Uighur"/>
+        <a:font script="Geor" typeface="Sylfaen"/>
+        <a:font script="Armn" typeface="Arial"/>
+        <a:font script="Bugi" typeface="Leelawadee UI"/>
+        <a:font script="Bopo" typeface="Microsoft JhengHei"/>
+        <a:font script="Java" typeface="Javanese Text"/>
+        <a:font script="Lisu" typeface="Segoe UI"/>
+        <a:font script="Mymr" typeface="Myanmar Text"/>
+        <a:font script="Nkoo" typeface="Ebrima"/>
+        <a:font script="Olck" typeface="Nirmala UI"/>
+        <a:font script="Osma" typeface="Ebrima"/>
+        <a:font script="Phag" typeface="Phagspa"/>
+        <a:font script="Syrn" typeface="Estrangelo Edessa"/>
+        <a:font script="Syrj" typeface="Estrangelo Edessa"/>
+        <a:font script="Syre" typeface="Estrangelo Edessa"/>
+        <a:font script="Sora" typeface="Nirmala UI"/>
+        <a:font script="Tale" typeface="Microsoft Tai Le"/>
+        <a:font script="Talu" typeface="Microsoft New Tai Lue"/>
+        <a:font script="Tfng" typeface="Ebrima"/>
       </a:majorFont>
       <a:minorFont>
-        <a:latin typeface="Cambria"/>
+        <a:latin typeface="Aptos" panose="02110004020202020204"/>
         <a:ea typeface=""/>
         <a:cs typeface=""/>
-        <a:font script="Jpan" typeface="ＭＳ 明朝"/>
+        <a:font script="Jpan" typeface="游明朝"/>
         <a:font script="Hang" typeface="맑은 고딕"/>
-        <a:font script="Hans" typeface="宋体"/>
+        <a:font script="Hans" typeface="等线"/>
         <a:font script="Hant" typeface="新細明體"/>
         <a:font script="Arab" typeface="Arial"/>
         <a:font script="Hebr" typeface="Arial"/>
@@ -1266,6 +1464,24 @@
         <a:font script="Mong" typeface="Mongolian Baiti"/>
         <a:font script="Viet" typeface="Arial"/>
         <a:font script="Uigh" typeface="Microsoft Uighur"/>
+        <a:font script="Geor" typeface="Sylfaen"/>
+        <a:font script="Armn" typeface="Arial"/>
+        <a:font script="Bugi" typeface="Leelawadee UI"/>
+        <a:font script="Bopo" typeface="Microsoft JhengHei"/>
+        <a:font script="Java" typeface="Javanese Text"/>
+        <a:font script="Lisu" typeface="Segoe UI"/>
+        <a:font script="Mymr" typeface="Myanmar Text"/>
+        <a:font script="Nkoo" typeface="Ebrima"/>
+        <a:font script="Olck" typeface="Nirmala UI"/>
+        <a:font script="Osma" typeface="Ebrima"/>
+        <a:font script="Phag" typeface="Phagspa"/>
+        <a:font script="Syrn" typeface="Estrangelo Edessa"/>
+        <a:font script="Syrj" typeface="Estrangelo Edessa"/>
+        <a:font script="Syre" typeface="Estrangelo Edessa"/>
+        <a:font script="Sora" typeface="Nirmala UI"/>
+        <a:font script="Tale" typeface="Microsoft Tai Le"/>
+        <a:font script="Talu" typeface="Microsoft New Tai Lue"/>
+        <a:font script="Tfng" typeface="Ebrima"/>
       </a:minorFont>
     </a:fontScheme>
     <a:fmtScheme name="Office">
@@ -1277,200 +1493,141 @@
           <a:gsLst>
             <a:gs pos="0">
               <a:schemeClr val="phClr">
-                <a:tint val="50000"/>
-                <a:satMod val="300000"/>
+                <a:lumMod val="110000"/>
+                <a:satMod val="105000"/>
+                <a:tint val="67000"/>
               </a:schemeClr>
             </a:gs>
-            <a:gs pos="35000">
+            <a:gs pos="50000">
               <a:schemeClr val="phClr">
-                <a:tint val="37000"/>
-                <a:satMod val="300000"/>
+                <a:lumMod val="105000"/>
+                <a:satMod val="103000"/>
+                <a:tint val="73000"/>
               </a:schemeClr>
             </a:gs>
             <a:gs pos="100000">
               <a:schemeClr val="phClr">
-                <a:tint val="15000"/>
-                <a:satMod val="350000"/>
+                <a:lumMod val="105000"/>
+                <a:satMod val="109000"/>
+                <a:tint val="81000"/>
               </a:schemeClr>
             </a:gs>
           </a:gsLst>
-          <a:lin ang="16200000" scaled="1"/>
+          <a:lin ang="5400000" scaled="0"/>
         </a:gradFill>
         <a:gradFill rotWithShape="1">
           <a:gsLst>
             <a:gs pos="0">
               <a:schemeClr val="phClr">
-                <a:tint val="100000"/>
+                <a:satMod val="103000"/>
+                <a:lumMod val="102000"/>
+                <a:tint val="94000"/>
+              </a:schemeClr>
+            </a:gs>
+            <a:gs pos="50000">
+              <a:schemeClr val="phClr">
+                <a:satMod val="110000"/>
+                <a:lumMod val="100000"/>
                 <a:shade val="100000"/>
-                <a:satMod val="130000"/>
               </a:schemeClr>
             </a:gs>
             <a:gs pos="100000">
               <a:schemeClr val="phClr">
-                <a:tint val="50000"/>
-                <a:shade val="100000"/>
-                <a:satMod val="350000"/>
+                <a:lumMod val="99000"/>
+                <a:satMod val="120000"/>
+                <a:shade val="78000"/>
               </a:schemeClr>
             </a:gs>
           </a:gsLst>
-          <a:lin ang="16200000" scaled="0"/>
+          <a:lin ang="5400000" scaled="0"/>
         </a:gradFill>
       </a:fillStyleLst>
       <a:lnStyleLst>
-        <a:ln w="9525" cap="flat" cmpd="sng" algn="ctr">
-          <a:solidFill>
-            <a:schemeClr val="phClr">
-              <a:shade val="95000"/>
-              <a:satMod val="105000"/>
-            </a:schemeClr>
-          </a:solidFill>
-          <a:prstDash val="solid"/>
-        </a:ln>
-        <a:ln w="25400" cap="flat" cmpd="sng" algn="ctr">
+        <a:ln w="6350" cap="flat" cmpd="sng" algn="ctr">
           <a:solidFill>
             <a:schemeClr val="phClr"/>
           </a:solidFill>
           <a:prstDash val="solid"/>
+          <a:miter lim="800000"/>
         </a:ln>
-        <a:ln w="38100" cap="flat" cmpd="sng" algn="ctr">
+        <a:ln w="12700" cap="flat" cmpd="sng" algn="ctr">
           <a:solidFill>
             <a:schemeClr val="phClr"/>
           </a:solidFill>
           <a:prstDash val="solid"/>
+          <a:miter lim="800000"/>
+        </a:ln>
+        <a:ln w="19050" cap="flat" cmpd="sng" algn="ctr">
+          <a:solidFill>
+            <a:schemeClr val="phClr"/>
+          </a:solidFill>
+          <a:prstDash val="solid"/>
+          <a:miter lim="800000"/>
         </a:ln>
       </a:lnStyleLst>
       <a:effectStyleLst>
         <a:effectStyle>
+          <a:effectLst/>
+        </a:effectStyle>
+        <a:effectStyle>
+          <a:effectLst/>
+        </a:effectStyle>
+        <a:effectStyle>
           <a:effectLst>
-            <a:outerShdw blurRad="40000" dist="20000" dir="5400000" rotWithShape="0">
+            <a:outerShdw blurRad="57150" dist="19050" dir="5400000" algn="ctr" rotWithShape="0">
               <a:srgbClr val="000000">
-                <a:alpha val="38000"/>
+                <a:alpha val="63000"/>
               </a:srgbClr>
             </a:outerShdw>
           </a:effectLst>
-        </a:effectStyle>
-        <a:effectStyle>
-          <a:effectLst>
-            <a:outerShdw blurRad="40000" dist="23000" dir="5400000" rotWithShape="0">
-              <a:srgbClr val="000000">
-                <a:alpha val="35000"/>
-              </a:srgbClr>
-            </a:outerShdw>
-          </a:effectLst>
-        </a:effectStyle>
-        <a:effectStyle>
-          <a:effectLst>
-            <a:outerShdw blurRad="40000" dist="23000" dir="5400000" rotWithShape="0">
-              <a:srgbClr val="000000">
-                <a:alpha val="35000"/>
-              </a:srgbClr>
-            </a:outerShdw>
-          </a:effectLst>
-          <a:scene3d>
-            <a:camera prst="orthographicFront">
-              <a:rot lat="0" lon="0" rev="0"/>
-            </a:camera>
-            <a:lightRig rig="threePt" dir="t">
-              <a:rot lat="0" lon="0" rev="1200000"/>
-            </a:lightRig>
-          </a:scene3d>
-          <a:sp3d>
-            <a:bevelT w="63500" h="25400"/>
-          </a:sp3d>
         </a:effectStyle>
       </a:effectStyleLst>
       <a:bgFillStyleLst>
         <a:solidFill>
           <a:schemeClr val="phClr"/>
         </a:solidFill>
+        <a:solidFill>
+          <a:schemeClr val="phClr">
+            <a:tint val="95000"/>
+            <a:satMod val="170000"/>
+          </a:schemeClr>
+        </a:solidFill>
         <a:gradFill rotWithShape="1">
           <a:gsLst>
             <a:gs pos="0">
               <a:schemeClr val="phClr">
-                <a:tint val="40000"/>
-                <a:satMod val="350000"/>
+                <a:tint val="93000"/>
+                <a:satMod val="150000"/>
+                <a:shade val="98000"/>
+                <a:lumMod val="102000"/>
               </a:schemeClr>
             </a:gs>
-            <a:gs pos="40000">
+            <a:gs pos="50000">
               <a:schemeClr val="phClr">
-                <a:tint val="45000"/>
-                <a:shade val="99000"/>
-                <a:satMod val="350000"/>
+                <a:tint val="98000"/>
+                <a:satMod val="130000"/>
+                <a:shade val="90000"/>
+                <a:lumMod val="103000"/>
               </a:schemeClr>
             </a:gs>
             <a:gs pos="100000">
               <a:schemeClr val="phClr">
-                <a:shade val="20000"/>
-                <a:satMod val="255000"/>
+                <a:shade val="63000"/>
+                <a:satMod val="120000"/>
               </a:schemeClr>
             </a:gs>
           </a:gsLst>
-          <a:path path="circle">
-            <a:fillToRect l="50000" t="-80000" r="50000" b="180000"/>
-          </a:path>
-        </a:gradFill>
-        <a:gradFill rotWithShape="1">
-          <a:gsLst>
-            <a:gs pos="0">
-              <a:schemeClr val="phClr">
-                <a:tint val="80000"/>
-                <a:satMod val="300000"/>
-              </a:schemeClr>
-            </a:gs>
-            <a:gs pos="100000">
-              <a:schemeClr val="phClr">
-                <a:shade val="30000"/>
-                <a:satMod val="200000"/>
-              </a:schemeClr>
-            </a:gs>
-          </a:gsLst>
-          <a:path path="circle">
-            <a:fillToRect l="50000" t="50000" r="50000" b="50000"/>
-          </a:path>
+          <a:lin ang="5400000" scaled="0"/>
         </a:gradFill>
       </a:bgFillStyleLst>
     </a:fmtScheme>
   </a:themeElements>
-  <a:objectDefaults>
-    <a:spDef>
-      <a:spPr/>
-      <a:bodyPr/>
-      <a:lstStyle/>
-      <a:style>
-        <a:lnRef idx="1">
-          <a:schemeClr val="accent1"/>
-        </a:lnRef>
-        <a:fillRef idx="3">
-          <a:schemeClr val="accent1"/>
-        </a:fillRef>
-        <a:effectRef idx="2">
-          <a:schemeClr val="accent1"/>
-        </a:effectRef>
-        <a:fontRef idx="minor">
-          <a:schemeClr val="lt1"/>
-        </a:fontRef>
-      </a:style>
-    </a:spDef>
-    <a:lnDef>
-      <a:spPr/>
-      <a:bodyPr/>
-      <a:lstStyle/>
-      <a:style>
-        <a:lnRef idx="2">
-          <a:schemeClr val="accent1"/>
-        </a:lnRef>
-        <a:fillRef idx="0">
-          <a:schemeClr val="accent1"/>
-        </a:fillRef>
-        <a:effectRef idx="1">
-          <a:schemeClr val="accent1"/>
-        </a:effectRef>
-        <a:fontRef idx="minor">
-          <a:schemeClr val="tx1"/>
-        </a:fontRef>
-      </a:style>
-    </a:lnDef>
-  </a:objectDefaults>
+  <a:objectDefaults/>
   <a:extraClrSchemeLst/>
+  <a:extLst>
+    <a:ext uri="{05A4C25C-085E-4340-85A3-A5531E510DB2}">
+      <thm15:themeFamily xmlns:thm15="http://schemas.microsoft.com/office/thememl/2012/main" name="Office Theme" id="{2E142A2C-CD16-42D6-873A-C26D2A0506FA}" vid="{1BDDFF52-6CD6-40A5-AB3C-68EB2F1E4D0A}"/>
+    </a:ext>
+  </a:extLst>
 </a:theme>
 </file>
</xml_diff>

<commit_message>
Add translation support script
</commit_message>
<xml_diff>
--- a/i18n/de/docusaurus-plugin-content-docs/current/contractual/hierarchie.docx
+++ b/i18n/de/docusaurus-plugin-content-docs/current/contractual/hierarchie.docx
@@ -2,42 +2,41 @@
 <file path=word/document.xml><?xml version="1.0" encoding="utf-8"?>
 <w:document xmlns:w="http://schemas.openxmlformats.org/wordprocessingml/2006/main" xmlns:m="http://schemas.openxmlformats.org/officeDocument/2006/math" xmlns:r="http://schemas.openxmlformats.org/officeDocument/2006/relationships" xmlns:o="urn:schemas-microsoft-com:office:office" xmlns:v="urn:schemas-microsoft-com:vml" xmlns:w10="urn:schemas-microsoft-com:office:word" xmlns:a="http://schemas.openxmlformats.org/drawingml/2006/main" xmlns:pic="http://schemas.openxmlformats.org/drawingml/2006/picture" xmlns:wp="http://schemas.openxmlformats.org/drawingml/2006/wordprocessingDrawing">
   <w:body>
-    <w:sdt>
-      <w:sdtPr>
-        <w:docPartObj>
-          <w:docPartGallery w:val="Table of Contents"/>
-          <w:docPartUnique/>
-        </w:docPartObj>
-      </w:sdtPr>
-      <w:sdtContent>
-        <w:p>
-          <w:pPr>
-            <w:pStyle w:val="TOCHeading"/>
-          </w:pPr>
-          <w:r>
-            <w:t xml:space="preserve">Table of Contents</w:t>
-          </w:r>
-        </w:p>
-        <w:p>
-          <w:r>
-            <w:fldChar w:fldCharType="begin" w:dirty="true"/>
-            <w:instrText xml:space="preserve">TOC \o "1-3" \h \z \u</w:instrText>
-            <w:fldChar w:fldCharType="separate"/>
-            <w:fldChar w:fldCharType="end"/>
-          </w:r>
-        </w:p>
-      </w:sdtContent>
-    </w:sdt>
+    <w:p>
+      <w:pPr>
+        <w:pStyle w:val="Title"/>
+      </w:pPr>
+      <w:r>
+        <w:t xml:space="preserve">Hiérarchie</w:t>
+      </w:r>
+      <w:r>
+        <w:t xml:space="preserve"> </w:t>
+      </w:r>
+      <w:r>
+        <w:t xml:space="preserve">des</w:t>
+      </w:r>
+      <w:r>
+        <w:t xml:space="preserve"> </w:t>
+      </w:r>
+      <w:r>
+        <w:t xml:space="preserve">documents</w:t>
+      </w:r>
+      <w:r>
+        <w:t xml:space="preserve"> </w:t>
+      </w:r>
+      <w:r>
+        <w:t xml:space="preserve">contractuels</w:t>
+      </w:r>
+    </w:p>
     <w:tbl>
       <w:tblPr>
         <w:tblStyle w:val="Table"/>
-        <w:tblW w:type="pct" w:w="5000"/>
-        <w:tblLayout w:type="fixed"/>
+        <w:tblW w:type="auto" w:w="0"/>
         <w:tblLook w:firstRow="0" w:lastRow="0" w:firstColumn="0" w:lastColumn="0" w:noHBand="0" w:noVBand="0" w:val="0000"/>
       </w:tblPr>
       <w:tblGrid>
-        <w:gridCol w:w="1013"/>
-        <w:gridCol w:w="6906"/>
+        <w:gridCol w:w="3960"/>
+        <w:gridCol w:w="3960"/>
       </w:tblGrid>
       <w:tr>
         <w:tc>
@@ -48,7 +47,7 @@
               <w:jc w:val="left"/>
             </w:pPr>
             <w:r>
-              <w:t xml:space="preserve">Referenz ct.am.jur.hdc 2.0</w:t>
+              <w:t xml:space="preserve">Référence</w:t>
             </w:r>
           </w:p>
         </w:tc>
@@ -57,7 +56,11 @@
           <w:p>
             <w:pPr>
               <w:pStyle w:val="Compact"/>
+              <w:jc w:val="left"/>
             </w:pPr>
+            <w:r>
+              <w:t xml:space="preserve">CT.AM.JUR.HDC 2.0</w:t>
+            </w:r>
           </w:p>
         </w:tc>
       </w:tr>
@@ -70,7 +73,7 @@
               <w:jc w:val="left"/>
             </w:pPr>
             <w:r>
-              <w:t xml:space="preserve">Datum 13. März 2024</w:t>
+              <w:t xml:space="preserve">Date</w:t>
             </w:r>
           </w:p>
         </w:tc>
@@ -79,7 +82,11 @@
           <w:p>
             <w:pPr>
               <w:pStyle w:val="Compact"/>
+              <w:jc w:val="left"/>
             </w:pPr>
+            <w:r>
+              <w:t xml:space="preserve">13 mars 2024</w:t>
+            </w:r>
           </w:p>
         </w:tc>
       </w:tr>
@@ -89,13 +96,7 @@
         <w:pStyle w:val="BodyText"/>
       </w:pPr>
       <w:r>
-        <w:t xml:space="preserve">Die Hierarchie vertraglicher Dokumente wird in einer Reihenfolge von festgelegt</w:t>
-      </w:r>
-      <w:r>
-        <w:t xml:space="preserve"> </w:t>
-      </w:r>
-      <w:r>
-        <w:t xml:space="preserve">Definierte Priorität:</w:t>
+        <w:t xml:space="preserve">La hiérarchie des documents contractuels est établie selon un ordre de priorité défini :</w:t>
       </w:r>
     </w:p>
     <w:p>
@@ -106,9 +107,14 @@
           <w:numId w:val="1001"/>
         </w:numPr>
       </w:pPr>
-      <w:r>
-        <w:t xml:space="preserve">[Allgemeine Verkaufs- und Nutzungsbedingungen (CGVU)] (CGVU.DOCX)</w:t>
-      </w:r>
+      <w:hyperlink r:id="rId20">
+        <w:r>
+          <w:rPr>
+            <w:rStyle w:val="Hyperlink"/>
+          </w:rPr>
+          <w:t xml:space="preserve">Conditions Générales de Vente et d'Utilisation (CGVU)</w:t>
+        </w:r>
+      </w:hyperlink>
     </w:p>
     <w:p>
       <w:pPr>
@@ -118,9 +124,14 @@
           <w:numId w:val="1001"/>
         </w:numPr>
       </w:pPr>
-      <w:r>
-        <w:t xml:space="preserve">[IaaS -Servicevertrag] (IaaS/SLA_IAAS.DOCX)</w:t>
-      </w:r>
+      <w:hyperlink r:id="rId21">
+        <w:r>
+          <w:rPr>
+            <w:rStyle w:val="Hyperlink"/>
+          </w:rPr>
+          <w:t xml:space="preserve">Convention de service IaaS</w:t>
+        </w:r>
+      </w:hyperlink>
     </w:p>
     <w:p>
       <w:pPr>
@@ -130,8 +141,19 @@
           <w:numId w:val="1001"/>
         </w:numPr>
       </w:pPr>
-      <w:r>
-        <w:t xml:space="preserve">[PAAS -Servicevereinbarung] (PAAS/SLA_PAAS.DOCX) (*)</w:t>
+      <w:hyperlink r:id="rId22">
+        <w:r>
+          <w:rPr>
+            <w:rStyle w:val="Hyperlink"/>
+          </w:rPr>
+          <w:t xml:space="preserve">Convention de service PaaS</w:t>
+        </w:r>
+      </w:hyperlink>
+      <w:r>
+        <w:t xml:space="preserve"> </w:t>
+      </w:r>
+      <w:r>
+        <w:t xml:space="preserve">(*)</w:t>
       </w:r>
     </w:p>
     <w:p>
@@ -143,7 +165,7 @@
         </w:numPr>
       </w:pPr>
       <w:r>
-        <w:t xml:space="preserve">Besondere Zustimmung (**)</w:t>
+        <w:t xml:space="preserve">Convention spécifique particulière (**)</w:t>
       </w:r>
     </w:p>
     <w:p>
@@ -151,19 +173,7 @@
         <w:pStyle w:val="FirstParagraph"/>
       </w:pPr>
       <w:r>
-        <w:t xml:space="preserve">(*) Es wird angegeben, dass diese PaaS -Servicevereinbarung ist</w:t>
-      </w:r>
-      <w:r>
-        <w:t xml:space="preserve"> </w:t>
-      </w:r>
-      <w:r>
-        <w:t xml:space="preserve">Nur gültig, wenn der Kunde die Vereinbarung über unterzeichnet hat</w:t>
-      </w:r>
-      <w:r>
-        <w:t xml:space="preserve"> </w:t>
-      </w:r>
-      <w:r>
-        <w:t xml:space="preserve">IaaS Secnumcloud Services.</w:t>
+        <w:t xml:space="preserve">(*) Il est spécifié que la présente Convention de services PaaS est valide uniquement si le CLIENT a signé la Convention concernant les services IaaS SecNumCloud.</w:t>
       </w:r>
     </w:p>
     <w:p>
@@ -171,13 +181,7 @@
         <w:pStyle w:val="BodyText"/>
       </w:pPr>
       <w:r>
-        <w:t xml:space="preserve">(**) Spezifische Vereinbarung, die sich an der ausrichten soll</w:t>
-      </w:r>
-      <w:r>
-        <w:t xml:space="preserve"> </w:t>
-      </w:r>
-      <w:r>
-        <w:t xml:space="preserve">Besonderheiten des Projekts.</w:t>
+        <w:t xml:space="preserve">(**) Convention spécifique, conçue pour s'aligner sur les particularités du projet.</w:t>
       </w:r>
     </w:p>
     <w:p>
@@ -189,28 +193,10 @@
           <w:i/>
           <w:iCs/>
         </w:rPr>
-        <w:t xml:space="preserve">Hinweis: Die Versionen, die in Englisch, Italienisch, Deutsch und Spanisch übersetzt wurden</w:t>
-      </w:r>
-      <w:r>
-        <w:rPr>
-          <w:i/>
-          <w:iCs/>
-        </w:rPr>
-        <w:t xml:space="preserve"> </w:t>
-      </w:r>
-      <w:r>
-        <w:rPr>
-          <w:i/>
-          <w:iCs/>
-        </w:rPr>
-        <w:t xml:space="preserve">werden nur bereitgestellt, um das Verständnis des Angebots zu erleichtern.</w:t>
+        <w:t xml:space="preserve">Note : Les versions traduites en anglais, italien, allemand et espagnol sont fournies uniquement pour faciliter la compréhension de l'offre.</w:t>
       </w:r>
     </w:p>
-    <w:sectPr>
-      <w:footnotePr>
-        <w:numRestart w:val="eachSect"/>
-      </w:footnotePr>
-    </w:sectPr>
+    <w:sectPr/>
   </w:body>
 </w:document>
 </file>
@@ -248,7 +234,7 @@
       <w:lvlText w:val=" "/>
       <w:lvlJc w:val="left"/>
       <w:pPr>
-        <w:ind w:left="720" w:hanging="360"/>
+        <w:ind w:left="720" w:hanging="480"/>
       </w:pPr>
     </w:lvl>
     <w:lvl w:ilvl="1">
@@ -256,7 +242,7 @@
       <w:lvlText w:val=" "/>
       <w:lvlJc w:val="left"/>
       <w:pPr>
-        <w:ind w:left="1440" w:hanging="360"/>
+        <w:ind w:left="1440" w:hanging="480"/>
       </w:pPr>
     </w:lvl>
     <w:lvl w:ilvl="2">
@@ -264,7 +250,7 @@
       <w:lvlText w:val=" "/>
       <w:lvlJc w:val="left"/>
       <w:pPr>
-        <w:ind w:left="2160" w:hanging="360"/>
+        <w:ind w:left="2160" w:hanging="480"/>
       </w:pPr>
     </w:lvl>
     <w:lvl w:ilvl="3">
@@ -272,7 +258,7 @@
       <w:lvlText w:val=" "/>
       <w:lvlJc w:val="left"/>
       <w:pPr>
-        <w:ind w:left="2880" w:hanging="360"/>
+        <w:ind w:left="2880" w:hanging="480"/>
       </w:pPr>
     </w:lvl>
     <w:lvl w:ilvl="4">
@@ -280,7 +266,7 @@
       <w:lvlText w:val=" "/>
       <w:lvlJc w:val="left"/>
       <w:pPr>
-        <w:ind w:left="3600" w:hanging="360"/>
+        <w:ind w:left="3600" w:hanging="480"/>
       </w:pPr>
     </w:lvl>
     <w:lvl w:ilvl="5">
@@ -288,7 +274,7 @@
       <w:lvlText w:val=" "/>
       <w:lvlJc w:val="left"/>
       <w:pPr>
-        <w:ind w:left="4320" w:hanging="360"/>
+        <w:ind w:left="4320" w:hanging="480"/>
       </w:pPr>
     </w:lvl>
     <w:lvl w:ilvl="6">
@@ -296,7 +282,7 @@
       <w:lvlText w:val=" "/>
       <w:lvlJc w:val="left"/>
       <w:pPr>
-        <w:ind w:left="5040" w:hanging="360"/>
+        <w:ind w:left="5040" w:hanging="480"/>
       </w:pPr>
     </w:lvl>
     <w:lvl w:ilvl="7">
@@ -304,7 +290,7 @@
       <w:lvlText w:val=" "/>
       <w:lvlJc w:val="left"/>
       <w:pPr>
-        <w:ind w:left="5760" w:hanging="360"/>
+        <w:ind w:left="5760" w:hanging="480"/>
       </w:pPr>
     </w:lvl>
     <w:lvl w:ilvl="8">
@@ -312,7 +298,7 @@
       <w:lvlText w:val=" "/>
       <w:lvlJc w:val="left"/>
       <w:pPr>
-        <w:ind w:left="6480" w:hanging="360"/>
+        <w:ind w:left="6480" w:hanging="480"/>
       </w:pPr>
     </w:lvl>
   </w:abstractNum>
@@ -325,7 +311,7 @@
       <w:lvlText w:val="%1."/>
       <w:lvlJc w:val="left"/>
       <w:pPr>
-        <w:ind w:left="720" w:hanging="360"/>
+        <w:ind w:left="720" w:hanging="480"/>
       </w:pPr>
     </w:lvl>
     <w:lvl w:ilvl="1">
@@ -334,7 +320,7 @@
       <w:lvlText w:val="%2."/>
       <w:lvlJc w:val="left"/>
       <w:pPr>
-        <w:ind w:left="1440" w:hanging="360"/>
+        <w:ind w:left="1440" w:hanging="480"/>
       </w:pPr>
     </w:lvl>
     <w:lvl w:ilvl="2">
@@ -343,7 +329,7 @@
       <w:lvlText w:val="%3."/>
       <w:lvlJc w:val="left"/>
       <w:pPr>
-        <w:ind w:left="2160" w:hanging="360"/>
+        <w:ind w:left="2160" w:hanging="480"/>
       </w:pPr>
     </w:lvl>
     <w:lvl w:ilvl="3">
@@ -352,7 +338,7 @@
       <w:lvlText w:val="%4."/>
       <w:lvlJc w:val="left"/>
       <w:pPr>
-        <w:ind w:left="2880" w:hanging="360"/>
+        <w:ind w:left="2880" w:hanging="480"/>
       </w:pPr>
     </w:lvl>
     <w:lvl w:ilvl="4">
@@ -361,7 +347,7 @@
       <w:lvlText w:val="%5."/>
       <w:lvlJc w:val="left"/>
       <w:pPr>
-        <w:ind w:left="3600" w:hanging="360"/>
+        <w:ind w:left="3600" w:hanging="480"/>
       </w:pPr>
     </w:lvl>
     <w:lvl w:ilvl="5">
@@ -370,7 +356,7 @@
       <w:lvlText w:val="%6."/>
       <w:lvlJc w:val="left"/>
       <w:pPr>
-        <w:ind w:left="4320" w:hanging="360"/>
+        <w:ind w:left="4320" w:hanging="480"/>
       </w:pPr>
     </w:lvl>
     <w:lvl w:ilvl="6">
@@ -379,7 +365,7 @@
       <w:lvlText w:val="%7."/>
       <w:lvlJc w:val="left"/>
       <w:pPr>
-        <w:ind w:left="5040" w:hanging="360"/>
+        <w:ind w:left="5040" w:hanging="480"/>
       </w:pPr>
     </w:lvl>
     <w:lvl w:ilvl="7">
@@ -388,7 +374,7 @@
       <w:lvlText w:val="%8."/>
       <w:lvlJc w:val="left"/>
       <w:pPr>
-        <w:ind w:left="5760" w:hanging="360"/>
+        <w:ind w:left="5760" w:hanging="480"/>
       </w:pPr>
     </w:lvl>
     <w:lvl w:ilvl="8">
@@ -397,7 +383,7 @@
       <w:lvlText w:val="%9."/>
       <w:lvlJc w:val="left"/>
       <w:pPr>
-        <w:ind w:left="6480" w:hanging="360"/>
+        <w:ind w:left="6480" w:hanging="480"/>
       </w:pPr>
     </w:lvl>
   </w:abstractNum>
@@ -486,451 +472,285 @@
     <w:name w:val="Title"/>
     <w:basedOn w:val="Normal"/>
     <w:next w:val="BodyText"/>
-    <w:link w:val="TitleChar"/>
-    <w:uiPriority w:val="10"/>
-    <w:qFormat/>
-    <w:rsid w:val="00A10FD9"/>
-    <w:pPr>
-      <w:spacing w:after="80" w:line="240" w:lineRule="auto"/>
-      <w:contextualSpacing/>
+    <w:qFormat/>
+    <w:pPr>
+      <w:keepNext/>
+      <w:keepLines/>
+      <w:spacing w:after="240" w:before="480"/>
       <w:jc w:val="center"/>
     </w:pPr>
     <w:rPr>
       <w:rFonts w:asciiTheme="majorHAnsi" w:cstheme="majorBidi" w:eastAsiaTheme="majorEastAsia" w:hAnsiTheme="majorHAnsi"/>
-      <w:sz w:val="56"/>
-      <w:szCs w:val="56"/>
-    </w:rPr>
-  </w:style>
-  <w:style w:customStyle="1" w:styleId="TitleChar" w:type="character">
-    <w:name w:val="Title Char"/>
-    <w:basedOn w:val="DefaultParagraphFont"/>
-    <w:link w:val="Title"/>
-    <w:uiPriority w:val="10"/>
-    <w:rsid w:val="00A10FD9"/>
-    <w:rPr>
-      <w:rFonts w:asciiTheme="majorHAnsi" w:cstheme="majorBidi" w:eastAsiaTheme="majorEastAsia" w:hAnsiTheme="majorHAnsi"/>
-      <w:sz w:val="56"/>
-      <w:szCs w:val="56"/>
+      <w:b/>
+      <w:bCs/>
+      <w:color w:themeColor="accent1" w:themeShade="B5" w:val="345A8A"/>
+      <w:sz w:val="36"/>
+      <w:szCs w:val="36"/>
     </w:rPr>
   </w:style>
   <w:style w:styleId="Subtitle" w:type="paragraph">
     <w:name w:val="Subtitle"/>
     <w:basedOn w:val="Title"/>
     <w:next w:val="BodyText"/>
-    <w:link w:val="SubtitleChar"/>
-    <w:uiPriority w:val="11"/>
-    <w:qFormat/>
-    <w:rsid w:val="00A10FD9"/>
-    <w:pPr>
-      <w:numPr>
-        <w:ilvl w:val="1"/>
-      </w:numPr>
-    </w:pPr>
-    <w:rPr>
-      <w:rFonts w:cstheme="majorBidi" w:eastAsiaTheme="majorEastAsia"/>
-      <w:spacing w:val="15"/>
+    <w:qFormat/>
+    <w:pPr>
+      <w:keepNext/>
+      <w:keepLines/>
+      <w:spacing w:after="240" w:before="240"/>
+      <w:jc w:val="center"/>
+    </w:pPr>
+    <w:rPr>
+      <w:sz w:val="30"/>
+      <w:szCs w:val="30"/>
+    </w:rPr>
+  </w:style>
+  <w:style w:customStyle="1" w:styleId="Author" w:type="paragraph">
+    <w:name w:val="Author"/>
+    <w:next w:val="BodyText"/>
+    <w:qFormat/>
+    <w:pPr>
+      <w:keepNext/>
+      <w:keepLines/>
+      <w:jc w:val="center"/>
+    </w:pPr>
+  </w:style>
+  <w:style w:styleId="Date" w:type="paragraph">
+    <w:name w:val="Date"/>
+    <w:next w:val="BodyText"/>
+    <w:qFormat/>
+    <w:pPr>
+      <w:keepNext/>
+      <w:keepLines/>
+      <w:jc w:val="center"/>
+    </w:pPr>
+  </w:style>
+  <w:style w:customStyle="1" w:styleId="AbstractTitle" w:type="paragraph">
+    <w:name w:val="Abstract Title"/>
+    <w:basedOn w:val="Normal"/>
+    <w:next w:val="Abstract"/>
+    <w:qFormat/>
+    <w:pPr>
+      <w:keepNext/>
+      <w:keepLines/>
+      <w:spacing w:after="0" w:before="300"/>
+      <w:jc w:val="center"/>
+    </w:pPr>
+    <w:rPr>
+      <w:b/>
+      <w:color w:val="345A8A"/>
+      <w:sz w:val="20"/>
+      <w:szCs w:val="20"/>
+    </w:rPr>
+  </w:style>
+  <w:style w:customStyle="1" w:styleId="Abstract" w:type="paragraph">
+    <w:name w:val="Abstract"/>
+    <w:basedOn w:val="Normal"/>
+    <w:next w:val="BodyText"/>
+    <w:qFormat/>
+    <w:pPr>
+      <w:keepNext/>
+      <w:keepLines/>
+      <w:spacing w:after="300" w:before="100"/>
+    </w:pPr>
+    <w:rPr>
+      <w:sz w:val="20"/>
+      <w:szCs w:val="20"/>
+    </w:rPr>
+  </w:style>
+  <w:style w:styleId="Bibliography" w:type="paragraph">
+    <w:name w:val="Bibliography"/>
+    <w:basedOn w:val="Normal"/>
+    <w:next w:val="Bibliography"/>
+    <w:qFormat/>
+    <w:pPr/>
+    <w:rPr/>
+  </w:style>
+  <w:style w:styleId="Heading1" w:type="paragraph">
+    <w:name w:val="Heading 1"/>
+    <w:basedOn w:val="Normal"/>
+    <w:next w:val="BodyText"/>
+    <w:uiPriority w:val="9"/>
+    <w:qFormat/>
+    <w:pPr>
+      <w:keepNext/>
+      <w:keepLines/>
+      <w:spacing w:after="0" w:before="480"/>
+      <w:outlineLvl w:val="0"/>
+    </w:pPr>
+    <w:rPr>
+      <w:rFonts w:asciiTheme="majorHAnsi" w:cstheme="majorBidi" w:eastAsiaTheme="majorEastAsia" w:hAnsiTheme="majorHAnsi"/>
+      <w:b/>
+      <w:bCs/>
+      <w:color w:themeColor="accent1" w:val="4F81BD"/>
+      <w:sz w:val="32"/>
+      <w:szCs w:val="32"/>
+    </w:rPr>
+  </w:style>
+  <w:style w:styleId="Heading2" w:type="paragraph">
+    <w:name w:val="Heading 2"/>
+    <w:basedOn w:val="Normal"/>
+    <w:next w:val="BodyText"/>
+    <w:uiPriority w:val="9"/>
+    <w:unhideWhenUsed/>
+    <w:qFormat/>
+    <w:pPr>
+      <w:keepNext/>
+      <w:keepLines/>
+      <w:spacing w:after="0" w:before="200"/>
+      <w:outlineLvl w:val="1"/>
+    </w:pPr>
+    <w:rPr>
+      <w:rFonts w:asciiTheme="majorHAnsi" w:cstheme="majorBidi" w:eastAsiaTheme="majorEastAsia" w:hAnsiTheme="majorHAnsi"/>
+      <w:b/>
+      <w:bCs/>
+      <w:color w:themeColor="accent1" w:val="4F81BD"/>
       <w:sz w:val="28"/>
       <w:szCs w:val="28"/>
     </w:rPr>
   </w:style>
-  <w:style w:customStyle="1" w:styleId="SubtitleChar" w:type="character">
-    <w:name w:val="Subtitle Char"/>
-    <w:basedOn w:val="DefaultParagraphFont"/>
-    <w:link w:val="Subtitle"/>
-    <w:uiPriority w:val="11"/>
-    <w:rsid w:val="00A10FD9"/>
-    <w:rPr>
-      <w:rFonts w:cstheme="majorBidi" w:eastAsiaTheme="majorEastAsia"/>
-      <w:color w:themeColor="text1" w:themeTint="A6" w:val="595959"/>
-      <w:spacing w:val="15"/>
-      <w:sz w:val="28"/>
-      <w:szCs w:val="28"/>
-    </w:rPr>
-  </w:style>
-  <w:style w:customStyle="1" w:styleId="Author" w:type="paragraph">
-    <w:name w:val="Author"/>
-    <w:basedOn w:val="Title"/>
-    <w:next w:val="BodyText"/>
-    <w:qFormat/>
-    <w:pPr>
-      <w:keepNext/>
-      <w:keepLines/>
-    </w:pPr>
-    <w:rPr>
+  <w:style w:styleId="Heading3" w:type="paragraph">
+    <w:name w:val="Heading 3"/>
+    <w:basedOn w:val="Normal"/>
+    <w:next w:val="BodyText"/>
+    <w:uiPriority w:val="9"/>
+    <w:unhideWhenUsed/>
+    <w:qFormat/>
+    <w:pPr>
+      <w:keepNext/>
+      <w:keepLines/>
+      <w:spacing w:after="0" w:before="200"/>
+      <w:outlineLvl w:val="2"/>
+    </w:pPr>
+    <w:rPr>
+      <w:rFonts w:asciiTheme="majorHAnsi" w:cstheme="majorBidi" w:eastAsiaTheme="majorEastAsia" w:hAnsiTheme="majorHAnsi"/>
+      <w:b/>
+      <w:bCs/>
+      <w:color w:themeColor="accent1" w:val="4F81BD"/>
       <w:sz w:val="24"/>
       <w:szCs w:val="24"/>
     </w:rPr>
   </w:style>
-  <w:style w:styleId="Date" w:type="paragraph">
-    <w:name w:val="Date"/>
-    <w:basedOn w:val="Title"/>
-    <w:next w:val="BodyText"/>
-    <w:qFormat/>
-    <w:pPr>
-      <w:keepNext/>
-      <w:keepLines/>
-    </w:pPr>
-    <w:rPr>
+  <w:style w:styleId="Heading4" w:type="paragraph">
+    <w:name w:val="Heading 4"/>
+    <w:basedOn w:val="Normal"/>
+    <w:next w:val="BodyText"/>
+    <w:uiPriority w:val="9"/>
+    <w:unhideWhenUsed/>
+    <w:qFormat/>
+    <w:pPr>
+      <w:keepNext/>
+      <w:keepLines/>
+      <w:spacing w:after="0" w:before="200"/>
+      <w:outlineLvl w:val="3"/>
+    </w:pPr>
+    <w:rPr>
+      <w:rFonts w:asciiTheme="majorHAnsi" w:cstheme="majorBidi" w:eastAsiaTheme="majorEastAsia" w:hAnsiTheme="majorHAnsi"/>
+      <w:bCs/>
+      <w:i/>
+      <w:color w:themeColor="accent1" w:val="4F81BD"/>
       <w:sz w:val="24"/>
       <w:szCs w:val="24"/>
     </w:rPr>
   </w:style>
-  <w:style w:customStyle="1" w:styleId="AbstractTitle" w:type="paragraph">
-    <w:name w:val="Abstract Title"/>
-    <w:basedOn w:val="Normal"/>
-    <w:next w:val="Abstract"/>
-    <w:qFormat/>
-    <w:pPr>
-      <w:keepNext/>
-      <w:keepLines/>
-      <w:spacing w:after="0" w:before="300"/>
-      <w:jc w:val="center"/>
-    </w:pPr>
-    <w:rPr>
-      <w:b/>
-      <w:sz w:val="20"/>
-      <w:szCs w:val="20"/>
-    </w:rPr>
-  </w:style>
-  <w:style w:customStyle="1" w:styleId="Abstract" w:type="paragraph">
-    <w:name w:val="Abstract"/>
-    <w:basedOn w:val="Normal"/>
-    <w:next w:val="BodyText"/>
-    <w:qFormat/>
-    <w:pPr>
-      <w:keepNext/>
-      <w:keepLines/>
-      <w:spacing w:after="300" w:before="100"/>
-    </w:pPr>
-    <w:rPr>
-      <w:sz w:val="20"/>
-      <w:szCs w:val="20"/>
-    </w:rPr>
-  </w:style>
-  <w:style w:styleId="Bibliography" w:type="paragraph">
-    <w:name w:val="Bibliography"/>
-    <w:basedOn w:val="Normal"/>
-    <w:next w:val="Bibliography"/>
-    <w:qFormat/>
-    <w:pPr/>
-    <w:rPr/>
-  </w:style>
-  <w:style w:styleId="Heading1" w:type="paragraph">
-    <w:name w:val="heading 1"/>
-    <w:basedOn w:val="Normal"/>
-    <w:next w:val="BodyText"/>
-    <w:link w:val="Heading1Char"/>
+  <w:style w:styleId="Heading5" w:type="paragraph">
+    <w:name w:val="Heading 5"/>
+    <w:basedOn w:val="Normal"/>
+    <w:next w:val="BodyText"/>
     <w:uiPriority w:val="9"/>
-    <w:qFormat/>
-    <w:rsid w:val="00A10FD9"/>
-    <w:pPr>
-      <w:keepNext/>
-      <w:keepLines/>
-      <w:spacing w:after="80" w:before="360"/>
-      <w:outlineLvl w:val="0"/>
+    <w:unhideWhenUsed/>
+    <w:qFormat/>
+    <w:pPr>
+      <w:keepNext/>
+      <w:keepLines/>
+      <w:spacing w:after="0" w:before="200"/>
+      <w:outlineLvl w:val="4"/>
     </w:pPr>
     <w:rPr>
       <w:rFonts w:asciiTheme="majorHAnsi" w:cstheme="majorBidi" w:eastAsiaTheme="majorEastAsia" w:hAnsiTheme="majorHAnsi"/>
-      <w:color w:themeColor="accent1" w:themeShade="BF" w:val="0F4761"/>
-      <w:sz w:val="40"/>
-      <w:szCs w:val="40"/>
-    </w:rPr>
-  </w:style>
-  <w:style w:styleId="Heading2" w:type="paragraph">
-    <w:name w:val="heading 2"/>
-    <w:basedOn w:val="Normal"/>
-    <w:next w:val="BodyText"/>
-    <w:link w:val="Heading2Char"/>
+      <w:iCs/>
+      <w:color w:themeColor="accent1" w:val="4F81BD"/>
+      <w:sz w:val="24"/>
+      <w:szCs w:val="24"/>
+    </w:rPr>
+  </w:style>
+  <w:style w:styleId="Heading6" w:type="paragraph">
+    <w:name w:val="Heading 6"/>
+    <w:basedOn w:val="Normal"/>
+    <w:next w:val="BodyText"/>
     <w:uiPriority w:val="9"/>
-    <w:semiHidden/>
     <w:unhideWhenUsed/>
     <w:qFormat/>
-    <w:rsid w:val="00A10FD9"/>
-    <w:pPr>
-      <w:keepNext/>
-      <w:keepLines/>
-      <w:spacing w:after="80" w:before="160"/>
-      <w:outlineLvl w:val="1"/>
+    <w:pPr>
+      <w:keepNext/>
+      <w:keepLines/>
+      <w:spacing w:after="0" w:before="200"/>
+      <w:outlineLvl w:val="5"/>
     </w:pPr>
     <w:rPr>
       <w:rFonts w:asciiTheme="majorHAnsi" w:cstheme="majorBidi" w:eastAsiaTheme="majorEastAsia" w:hAnsiTheme="majorHAnsi"/>
-      <w:color w:themeColor="accent1" w:themeShade="BF" w:val="0F4761"/>
-      <w:sz w:val="32"/>
-      <w:szCs w:val="32"/>
-    </w:rPr>
-  </w:style>
-  <w:style w:styleId="Heading3" w:type="paragraph">
-    <w:name w:val="heading 3"/>
-    <w:basedOn w:val="Normal"/>
-    <w:next w:val="BodyText"/>
-    <w:link w:val="Heading3Char"/>
+      <w:color w:themeColor="accent1" w:val="4F81BD"/>
+      <w:sz w:val="24"/>
+      <w:szCs w:val="24"/>
+    </w:rPr>
+  </w:style>
+  <w:style w:styleId="Heading7" w:type="paragraph">
+    <w:name w:val="Heading 7"/>
+    <w:basedOn w:val="Normal"/>
+    <w:next w:val="BodyText"/>
     <w:uiPriority w:val="9"/>
-    <w:semiHidden/>
     <w:unhideWhenUsed/>
     <w:qFormat/>
-    <w:rsid w:val="00A10FD9"/>
-    <w:pPr>
-      <w:keepNext/>
-      <w:keepLines/>
-      <w:spacing w:after="80" w:before="160"/>
-      <w:outlineLvl w:val="2"/>
-    </w:pPr>
-    <w:rPr>
-      <w:rFonts w:cstheme="majorBidi" w:eastAsiaTheme="majorEastAsia"/>
-      <w:color w:themeColor="accent1" w:themeShade="BF" w:val="0F4761"/>
-      <w:sz w:val="28"/>
-      <w:szCs w:val="28"/>
-    </w:rPr>
-  </w:style>
-  <w:style w:styleId="Heading4" w:type="paragraph">
-    <w:name w:val="heading 4"/>
-    <w:basedOn w:val="Normal"/>
-    <w:next w:val="BodyText"/>
-    <w:link w:val="Heading4Char"/>
+    <w:pPr>
+      <w:keepNext/>
+      <w:keepLines/>
+      <w:spacing w:after="0" w:before="200"/>
+      <w:outlineLvl w:val="6"/>
+    </w:pPr>
+    <w:rPr>
+      <w:rFonts w:asciiTheme="majorHAnsi" w:cstheme="majorBidi" w:eastAsiaTheme="majorEastAsia" w:hAnsiTheme="majorHAnsi"/>
+      <w:color w:themeColor="accent1" w:val="4F81BD"/>
+      <w:sz w:val="24"/>
+      <w:szCs w:val="24"/>
+    </w:rPr>
+  </w:style>
+  <w:style w:styleId="Heading8" w:type="paragraph">
+    <w:name w:val="Heading 8"/>
+    <w:basedOn w:val="Normal"/>
+    <w:next w:val="BodyText"/>
     <w:uiPriority w:val="9"/>
-    <w:semiHidden/>
     <w:unhideWhenUsed/>
     <w:qFormat/>
-    <w:rsid w:val="00A10FD9"/>
-    <w:pPr>
-      <w:keepNext/>
-      <w:keepLines/>
-      <w:spacing w:after="40" w:before="80"/>
-      <w:outlineLvl w:val="3"/>
-    </w:pPr>
-    <w:rPr>
-      <w:rFonts w:cstheme="majorBidi" w:eastAsiaTheme="majorEastAsia"/>
-      <w:i/>
-      <w:iCs/>
-      <w:color w:themeColor="accent1" w:themeShade="BF" w:val="0F4761"/>
-    </w:rPr>
-  </w:style>
-  <w:style w:styleId="Heading5" w:type="paragraph">
-    <w:name w:val="heading 5"/>
-    <w:basedOn w:val="Normal"/>
-    <w:next w:val="BodyText"/>
-    <w:link w:val="Heading5Char"/>
+    <w:pPr>
+      <w:keepNext/>
+      <w:keepLines/>
+      <w:spacing w:after="0" w:before="200"/>
+      <w:outlineLvl w:val="7"/>
+    </w:pPr>
+    <w:rPr>
+      <w:rFonts w:asciiTheme="majorHAnsi" w:cstheme="majorBidi" w:eastAsiaTheme="majorEastAsia" w:hAnsiTheme="majorHAnsi"/>
+      <w:color w:themeColor="accent1" w:val="4F81BD"/>
+      <w:sz w:val="24"/>
+      <w:szCs w:val="24"/>
+    </w:rPr>
+  </w:style>
+  <w:style w:styleId="Heading9" w:type="paragraph">
+    <w:name w:val="Heading 9"/>
+    <w:basedOn w:val="Normal"/>
+    <w:next w:val="BodyText"/>
     <w:uiPriority w:val="9"/>
-    <w:semiHidden/>
     <w:unhideWhenUsed/>
     <w:qFormat/>
-    <w:rsid w:val="00A10FD9"/>
-    <w:pPr>
-      <w:keepNext/>
-      <w:keepLines/>
-      <w:spacing w:after="40" w:before="80"/>
-      <w:outlineLvl w:val="4"/>
-    </w:pPr>
-    <w:rPr>
-      <w:rFonts w:cstheme="majorBidi" w:eastAsiaTheme="majorEastAsia"/>
-      <w:color w:themeColor="accent1" w:themeShade="BF" w:val="0F4761"/>
-    </w:rPr>
-  </w:style>
-  <w:style w:styleId="Heading6" w:type="paragraph">
-    <w:name w:val="heading 6"/>
-    <w:basedOn w:val="Normal"/>
-    <w:next w:val="BodyText"/>
-    <w:link w:val="Heading6Char"/>
-    <w:uiPriority w:val="9"/>
-    <w:semiHidden/>
-    <w:unhideWhenUsed/>
-    <w:qFormat/>
-    <w:rsid w:val="00A10FD9"/>
-    <w:pPr>
-      <w:keepNext/>
-      <w:keepLines/>
-      <w:spacing w:after="0" w:before="40"/>
-      <w:outlineLvl w:val="5"/>
-    </w:pPr>
-    <w:rPr>
-      <w:rFonts w:cstheme="majorBidi" w:eastAsiaTheme="majorEastAsia"/>
-      <w:i/>
-      <w:iCs/>
-      <w:color w:themeColor="text1" w:themeTint="A6" w:val="595959"/>
-    </w:rPr>
-  </w:style>
-  <w:style w:styleId="Heading7" w:type="paragraph">
-    <w:name w:val="heading 7"/>
-    <w:basedOn w:val="Normal"/>
-    <w:next w:val="BodyText"/>
-    <w:link w:val="Heading7Char"/>
-    <w:uiPriority w:val="9"/>
-    <w:semiHidden/>
-    <w:unhideWhenUsed/>
-    <w:qFormat/>
-    <w:rsid w:val="00A10FD9"/>
-    <w:pPr>
-      <w:keepNext/>
-      <w:keepLines/>
-      <w:spacing w:after="0" w:before="40"/>
-      <w:outlineLvl w:val="6"/>
-    </w:pPr>
-    <w:rPr>
-      <w:rFonts w:cstheme="majorBidi" w:eastAsiaTheme="majorEastAsia"/>
-      <w:color w:themeColor="text1" w:themeTint="A6" w:val="595959"/>
-    </w:rPr>
-  </w:style>
-  <w:style w:styleId="Heading8" w:type="paragraph">
-    <w:name w:val="heading 8"/>
-    <w:basedOn w:val="Normal"/>
-    <w:next w:val="BodyText"/>
-    <w:link w:val="Heading8Char"/>
-    <w:uiPriority w:val="9"/>
-    <w:semiHidden/>
-    <w:unhideWhenUsed/>
-    <w:qFormat/>
-    <w:rsid w:val="00A10FD9"/>
-    <w:pPr>
-      <w:keepNext/>
-      <w:keepLines/>
-      <w:spacing w:after="0"/>
-      <w:outlineLvl w:val="7"/>
-    </w:pPr>
-    <w:rPr>
-      <w:rFonts w:cstheme="majorBidi" w:eastAsiaTheme="majorEastAsia"/>
-      <w:i/>
-      <w:iCs/>
-      <w:color w:themeColor="text1" w:themeTint="D8" w:val="272727"/>
-    </w:rPr>
-  </w:style>
-  <w:style w:styleId="Heading9" w:type="paragraph">
-    <w:name w:val="heading 9"/>
-    <w:basedOn w:val="Normal"/>
-    <w:next w:val="BodyText"/>
-    <w:link w:val="Heading9Char"/>
-    <w:uiPriority w:val="9"/>
-    <w:semiHidden/>
-    <w:unhideWhenUsed/>
-    <w:qFormat/>
-    <w:rsid w:val="00A10FD9"/>
-    <w:pPr>
-      <w:keepNext/>
-      <w:keepLines/>
-      <w:spacing w:after="0"/>
+    <w:pPr>
+      <w:keepNext/>
+      <w:keepLines/>
+      <w:spacing w:after="0" w:before="200"/>
       <w:outlineLvl w:val="8"/>
     </w:pPr>
     <w:rPr>
-      <w:rFonts w:cstheme="majorBidi" w:eastAsiaTheme="majorEastAsia"/>
-      <w:color w:themeColor="text1" w:themeTint="D8" w:val="272727"/>
-    </w:rPr>
-  </w:style>
-  <w:style w:customStyle="1" w:styleId="Heading1Char" w:type="character">
-    <w:name w:val="Heading 1 Char"/>
-    <w:basedOn w:val="DefaultParagraphFont"/>
-    <w:link w:val="Heading1"/>
-    <w:uiPriority w:val="9"/>
-    <w:rsid w:val="00A10FD9"/>
-    <w:rPr>
       <w:rFonts w:asciiTheme="majorHAnsi" w:cstheme="majorBidi" w:eastAsiaTheme="majorEastAsia" w:hAnsiTheme="majorHAnsi"/>
-      <w:color w:themeColor="accent1" w:themeShade="BF" w:val="0F4761"/>
-      <w:sz w:val="40"/>
-      <w:szCs w:val="40"/>
-    </w:rPr>
-  </w:style>
-  <w:style w:customStyle="1" w:styleId="Heading2Char" w:type="character">
-    <w:name w:val="Heading 2 Char"/>
-    <w:basedOn w:val="DefaultParagraphFont"/>
-    <w:link w:val="Heading2"/>
-    <w:uiPriority w:val="9"/>
-    <w:semiHidden/>
-    <w:rsid w:val="00A10FD9"/>
-    <w:rPr>
-      <w:rFonts w:asciiTheme="majorHAnsi" w:cstheme="majorBidi" w:eastAsiaTheme="majorEastAsia" w:hAnsiTheme="majorHAnsi"/>
-      <w:color w:themeColor="accent1" w:themeShade="BF" w:val="0F4761"/>
-      <w:sz w:val="32"/>
-      <w:szCs w:val="32"/>
-    </w:rPr>
-  </w:style>
-  <w:style w:customStyle="1" w:styleId="Heading3Char" w:type="character">
-    <w:name w:val="Heading 3 Char"/>
-    <w:basedOn w:val="DefaultParagraphFont"/>
-    <w:link w:val="Heading3"/>
-    <w:uiPriority w:val="9"/>
-    <w:semiHidden/>
-    <w:rsid w:val="00A10FD9"/>
-    <w:rPr>
-      <w:rFonts w:cstheme="majorBidi" w:eastAsiaTheme="majorEastAsia"/>
-      <w:color w:themeColor="accent1" w:themeShade="BF" w:val="0F4761"/>
-      <w:sz w:val="28"/>
-      <w:szCs w:val="28"/>
-    </w:rPr>
-  </w:style>
-  <w:style w:customStyle="1" w:styleId="Heading4Char" w:type="character">
-    <w:name w:val="Heading 4 Char"/>
-    <w:basedOn w:val="DefaultParagraphFont"/>
-    <w:link w:val="Heading4"/>
-    <w:uiPriority w:val="9"/>
-    <w:semiHidden/>
-    <w:rsid w:val="00A10FD9"/>
-    <w:rPr>
-      <w:rFonts w:cstheme="majorBidi" w:eastAsiaTheme="majorEastAsia"/>
-      <w:i/>
-      <w:iCs/>
-      <w:color w:themeColor="accent1" w:themeShade="BF" w:val="0F4761"/>
-    </w:rPr>
-  </w:style>
-  <w:style w:customStyle="1" w:styleId="Heading5Char" w:type="character">
-    <w:name w:val="Heading 5 Char"/>
-    <w:basedOn w:val="DefaultParagraphFont"/>
-    <w:link w:val="Heading5"/>
-    <w:uiPriority w:val="9"/>
-    <w:semiHidden/>
-    <w:rsid w:val="00A10FD9"/>
-    <w:rPr>
-      <w:rFonts w:cstheme="majorBidi" w:eastAsiaTheme="majorEastAsia"/>
-      <w:color w:themeColor="accent1" w:themeShade="BF" w:val="0F4761"/>
-    </w:rPr>
-  </w:style>
-  <w:style w:customStyle="1" w:styleId="Heading6Char" w:type="character">
-    <w:name w:val="Heading 6 Char"/>
-    <w:basedOn w:val="DefaultParagraphFont"/>
-    <w:link w:val="Heading6"/>
-    <w:uiPriority w:val="9"/>
-    <w:semiHidden/>
-    <w:rsid w:val="00A10FD9"/>
-    <w:rPr>
-      <w:rFonts w:cstheme="majorBidi" w:eastAsiaTheme="majorEastAsia"/>
-      <w:i/>
-      <w:iCs/>
-      <w:color w:themeColor="text1" w:themeTint="A6" w:val="595959"/>
-    </w:rPr>
-  </w:style>
-  <w:style w:customStyle="1" w:styleId="Heading7Char" w:type="character">
-    <w:name w:val="Heading 7 Char"/>
-    <w:basedOn w:val="DefaultParagraphFont"/>
-    <w:link w:val="Heading7"/>
-    <w:uiPriority w:val="9"/>
-    <w:semiHidden/>
-    <w:rsid w:val="00A10FD9"/>
-    <w:rPr>
-      <w:rFonts w:cstheme="majorBidi" w:eastAsiaTheme="majorEastAsia"/>
-      <w:color w:themeColor="text1" w:themeTint="A6" w:val="595959"/>
-    </w:rPr>
-  </w:style>
-  <w:style w:customStyle="1" w:styleId="Heading8Char" w:type="character">
-    <w:name w:val="Heading 8 Char"/>
-    <w:basedOn w:val="DefaultParagraphFont"/>
-    <w:link w:val="Heading8"/>
-    <w:uiPriority w:val="9"/>
-    <w:semiHidden/>
-    <w:rsid w:val="00A10FD9"/>
-    <w:rPr>
-      <w:rFonts w:cstheme="majorBidi" w:eastAsiaTheme="majorEastAsia"/>
-      <w:i/>
-      <w:iCs/>
-      <w:color w:themeColor="text1" w:themeTint="D8" w:val="272727"/>
-    </w:rPr>
-  </w:style>
-  <w:style w:customStyle="1" w:styleId="Heading9Char" w:type="character">
-    <w:name w:val="Heading 9 Char"/>
-    <w:basedOn w:val="DefaultParagraphFont"/>
-    <w:link w:val="Heading9"/>
-    <w:uiPriority w:val="9"/>
-    <w:semiHidden/>
-    <w:rsid w:val="00A10FD9"/>
-    <w:rPr>
-      <w:rFonts w:cstheme="majorBidi" w:eastAsiaTheme="majorEastAsia"/>
-      <w:color w:themeColor="text1" w:themeTint="D8" w:val="272727"/>
+      <w:color w:themeColor="accent1" w:val="4F81BD"/>
+      <w:sz w:val="24"/>
+      <w:szCs w:val="24"/>
     </w:rPr>
   </w:style>
   <w:style w:styleId="BlockText" w:type="paragraph">
@@ -955,8 +775,8 @@
   </w:style>
   <w:style w:styleId="FootnoteBlockText" w:type="paragraph">
     <w:name w:val="Footnote Block Text"/>
-    <w:basedOn w:val="FootnoteText"/>
-    <w:next w:val="FootnoteText"/>
+    <w:basedOn w:val="Footnote Text"/>
+    <w:next w:val="Footnote Text"/>
     <w:uiPriority w:val="9"/>
     <w:unhideWhenUsed/>
     <w:qFormat/>
@@ -1348,44 +1168,44 @@
         <a:sysClr val="window" lastClr="FFFFFF"/>
       </a:lt1>
       <a:dk2>
-        <a:srgbClr val="0E2841"/>
+        <a:srgbClr val="1F497D"/>
       </a:dk2>
       <a:lt2>
-        <a:srgbClr val="E8E8E8"/>
+        <a:srgbClr val="EEECE1"/>
       </a:lt2>
       <a:accent1>
-        <a:srgbClr val="156082"/>
+        <a:srgbClr val="4F81BD"/>
       </a:accent1>
       <a:accent2>
-        <a:srgbClr val="E97132"/>
+        <a:srgbClr val="C0504D"/>
       </a:accent2>
       <a:accent3>
-        <a:srgbClr val="196B24"/>
+        <a:srgbClr val="9BBB59"/>
       </a:accent3>
       <a:accent4>
-        <a:srgbClr val="0F9ED5"/>
+        <a:srgbClr val="8064A2"/>
       </a:accent4>
       <a:accent5>
-        <a:srgbClr val="A02B93"/>
+        <a:srgbClr val="4BACC6"/>
       </a:accent5>
       <a:accent6>
-        <a:srgbClr val="4EA72E"/>
+        <a:srgbClr val="F79646"/>
       </a:accent6>
       <a:hlink>
-        <a:srgbClr val="467886"/>
+        <a:srgbClr val="0000FF"/>
       </a:hlink>
       <a:folHlink>
-        <a:srgbClr val="96607D"/>
+        <a:srgbClr val="800080"/>
       </a:folHlink>
     </a:clrScheme>
     <a:fontScheme name="Office">
       <a:majorFont>
-        <a:latin typeface="Aptos Display" panose="02110004020202020204"/>
+        <a:latin typeface="Calibri"/>
         <a:ea typeface=""/>
         <a:cs typeface=""/>
-        <a:font script="Jpan" typeface="游ゴシック Light"/>
+        <a:font script="Jpan" typeface="ＭＳ ゴシック"/>
         <a:font script="Hang" typeface="맑은 고딕"/>
-        <a:font script="Hans" typeface="等线 Light"/>
+        <a:font script="Hans" typeface="宋体"/>
         <a:font script="Hant" typeface="新細明體"/>
         <a:font script="Arab" typeface="Times New Roman"/>
         <a:font script="Hebr" typeface="Times New Roman"/>
@@ -1412,32 +1232,14 @@
         <a:font script="Mong" typeface="Mongolian Baiti"/>
         <a:font script="Viet" typeface="Times New Roman"/>
         <a:font script="Uigh" typeface="Microsoft Uighur"/>
-        <a:font script="Geor" typeface="Sylfaen"/>
-        <a:font script="Armn" typeface="Arial"/>
-        <a:font script="Bugi" typeface="Leelawadee UI"/>
-        <a:font script="Bopo" typeface="Microsoft JhengHei"/>
-        <a:font script="Java" typeface="Javanese Text"/>
-        <a:font script="Lisu" typeface="Segoe UI"/>
-        <a:font script="Mymr" typeface="Myanmar Text"/>
-        <a:font script="Nkoo" typeface="Ebrima"/>
-        <a:font script="Olck" typeface="Nirmala UI"/>
-        <a:font script="Osma" typeface="Ebrima"/>
-        <a:font script="Phag" typeface="Phagspa"/>
-        <a:font script="Syrn" typeface="Estrangelo Edessa"/>
-        <a:font script="Syrj" typeface="Estrangelo Edessa"/>
-        <a:font script="Syre" typeface="Estrangelo Edessa"/>
-        <a:font script="Sora" typeface="Nirmala UI"/>
-        <a:font script="Tale" typeface="Microsoft Tai Le"/>
-        <a:font script="Talu" typeface="Microsoft New Tai Lue"/>
-        <a:font script="Tfng" typeface="Ebrima"/>
       </a:majorFont>
       <a:minorFont>
-        <a:latin typeface="Aptos" panose="02110004020202020204"/>
+        <a:latin typeface="Cambria"/>
         <a:ea typeface=""/>
         <a:cs typeface=""/>
-        <a:font script="Jpan" typeface="游明朝"/>
+        <a:font script="Jpan" typeface="ＭＳ 明朝"/>
         <a:font script="Hang" typeface="맑은 고딕"/>
-        <a:font script="Hans" typeface="等线"/>
+        <a:font script="Hans" typeface="宋体"/>
         <a:font script="Hant" typeface="新細明體"/>
         <a:font script="Arab" typeface="Arial"/>
         <a:font script="Hebr" typeface="Arial"/>
@@ -1464,24 +1266,6 @@
         <a:font script="Mong" typeface="Mongolian Baiti"/>
         <a:font script="Viet" typeface="Arial"/>
         <a:font script="Uigh" typeface="Microsoft Uighur"/>
-        <a:font script="Geor" typeface="Sylfaen"/>
-        <a:font script="Armn" typeface="Arial"/>
-        <a:font script="Bugi" typeface="Leelawadee UI"/>
-        <a:font script="Bopo" typeface="Microsoft JhengHei"/>
-        <a:font script="Java" typeface="Javanese Text"/>
-        <a:font script="Lisu" typeface="Segoe UI"/>
-        <a:font script="Mymr" typeface="Myanmar Text"/>
-        <a:font script="Nkoo" typeface="Ebrima"/>
-        <a:font script="Olck" typeface="Nirmala UI"/>
-        <a:font script="Osma" typeface="Ebrima"/>
-        <a:font script="Phag" typeface="Phagspa"/>
-        <a:font script="Syrn" typeface="Estrangelo Edessa"/>
-        <a:font script="Syrj" typeface="Estrangelo Edessa"/>
-        <a:font script="Syre" typeface="Estrangelo Edessa"/>
-        <a:font script="Sora" typeface="Nirmala UI"/>
-        <a:font script="Tale" typeface="Microsoft Tai Le"/>
-        <a:font script="Talu" typeface="Microsoft New Tai Lue"/>
-        <a:font script="Tfng" typeface="Ebrima"/>
       </a:minorFont>
     </a:fontScheme>
     <a:fmtScheme name="Office">
@@ -1493,141 +1277,200 @@
           <a:gsLst>
             <a:gs pos="0">
               <a:schemeClr val="phClr">
-                <a:lumMod val="110000"/>
-                <a:satMod val="105000"/>
-                <a:tint val="67000"/>
+                <a:tint val="50000"/>
+                <a:satMod val="300000"/>
               </a:schemeClr>
             </a:gs>
-            <a:gs pos="50000">
+            <a:gs pos="35000">
               <a:schemeClr val="phClr">
-                <a:lumMod val="105000"/>
-                <a:satMod val="103000"/>
-                <a:tint val="73000"/>
+                <a:tint val="37000"/>
+                <a:satMod val="300000"/>
               </a:schemeClr>
             </a:gs>
             <a:gs pos="100000">
               <a:schemeClr val="phClr">
-                <a:lumMod val="105000"/>
-                <a:satMod val="109000"/>
-                <a:tint val="81000"/>
+                <a:tint val="15000"/>
+                <a:satMod val="350000"/>
               </a:schemeClr>
             </a:gs>
           </a:gsLst>
-          <a:lin ang="5400000" scaled="0"/>
+          <a:lin ang="16200000" scaled="1"/>
         </a:gradFill>
         <a:gradFill rotWithShape="1">
           <a:gsLst>
             <a:gs pos="0">
               <a:schemeClr val="phClr">
-                <a:satMod val="103000"/>
-                <a:lumMod val="102000"/>
-                <a:tint val="94000"/>
-              </a:schemeClr>
-            </a:gs>
-            <a:gs pos="50000">
-              <a:schemeClr val="phClr">
-                <a:satMod val="110000"/>
-                <a:lumMod val="100000"/>
+                <a:tint val="100000"/>
                 <a:shade val="100000"/>
+                <a:satMod val="130000"/>
               </a:schemeClr>
             </a:gs>
             <a:gs pos="100000">
               <a:schemeClr val="phClr">
-                <a:lumMod val="99000"/>
-                <a:satMod val="120000"/>
-                <a:shade val="78000"/>
+                <a:tint val="50000"/>
+                <a:shade val="100000"/>
+                <a:satMod val="350000"/>
               </a:schemeClr>
             </a:gs>
           </a:gsLst>
-          <a:lin ang="5400000" scaled="0"/>
+          <a:lin ang="16200000" scaled="0"/>
         </a:gradFill>
       </a:fillStyleLst>
       <a:lnStyleLst>
-        <a:ln w="6350" cap="flat" cmpd="sng" algn="ctr">
+        <a:ln w="9525" cap="flat" cmpd="sng" algn="ctr">
+          <a:solidFill>
+            <a:schemeClr val="phClr">
+              <a:shade val="95000"/>
+              <a:satMod val="105000"/>
+            </a:schemeClr>
+          </a:solidFill>
+          <a:prstDash val="solid"/>
+        </a:ln>
+        <a:ln w="25400" cap="flat" cmpd="sng" algn="ctr">
           <a:solidFill>
             <a:schemeClr val="phClr"/>
           </a:solidFill>
           <a:prstDash val="solid"/>
-          <a:miter lim="800000"/>
         </a:ln>
-        <a:ln w="12700" cap="flat" cmpd="sng" algn="ctr">
+        <a:ln w="38100" cap="flat" cmpd="sng" algn="ctr">
           <a:solidFill>
             <a:schemeClr val="phClr"/>
           </a:solidFill>
           <a:prstDash val="solid"/>
-          <a:miter lim="800000"/>
-        </a:ln>
-        <a:ln w="19050" cap="flat" cmpd="sng" algn="ctr">
-          <a:solidFill>
-            <a:schemeClr val="phClr"/>
-          </a:solidFill>
-          <a:prstDash val="solid"/>
-          <a:miter lim="800000"/>
         </a:ln>
       </a:lnStyleLst>
       <a:effectStyleLst>
         <a:effectStyle>
-          <a:effectLst/>
-        </a:effectStyle>
-        <a:effectStyle>
-          <a:effectLst/>
+          <a:effectLst>
+            <a:outerShdw blurRad="40000" dist="20000" dir="5400000" rotWithShape="0">
+              <a:srgbClr val="000000">
+                <a:alpha val="38000"/>
+              </a:srgbClr>
+            </a:outerShdw>
+          </a:effectLst>
         </a:effectStyle>
         <a:effectStyle>
           <a:effectLst>
-            <a:outerShdw blurRad="57150" dist="19050" dir="5400000" algn="ctr" rotWithShape="0">
+            <a:outerShdw blurRad="40000" dist="23000" dir="5400000" rotWithShape="0">
               <a:srgbClr val="000000">
-                <a:alpha val="63000"/>
+                <a:alpha val="35000"/>
               </a:srgbClr>
             </a:outerShdw>
           </a:effectLst>
+        </a:effectStyle>
+        <a:effectStyle>
+          <a:effectLst>
+            <a:outerShdw blurRad="40000" dist="23000" dir="5400000" rotWithShape="0">
+              <a:srgbClr val="000000">
+                <a:alpha val="35000"/>
+              </a:srgbClr>
+            </a:outerShdw>
+          </a:effectLst>
+          <a:scene3d>
+            <a:camera prst="orthographicFront">
+              <a:rot lat="0" lon="0" rev="0"/>
+            </a:camera>
+            <a:lightRig rig="threePt" dir="t">
+              <a:rot lat="0" lon="0" rev="1200000"/>
+            </a:lightRig>
+          </a:scene3d>
+          <a:sp3d>
+            <a:bevelT w="63500" h="25400"/>
+          </a:sp3d>
         </a:effectStyle>
       </a:effectStyleLst>
       <a:bgFillStyleLst>
         <a:solidFill>
           <a:schemeClr val="phClr"/>
         </a:solidFill>
-        <a:solidFill>
-          <a:schemeClr val="phClr">
-            <a:tint val="95000"/>
-            <a:satMod val="170000"/>
-          </a:schemeClr>
-        </a:solidFill>
         <a:gradFill rotWithShape="1">
           <a:gsLst>
             <a:gs pos="0">
               <a:schemeClr val="phClr">
-                <a:tint val="93000"/>
-                <a:satMod val="150000"/>
-                <a:shade val="98000"/>
-                <a:lumMod val="102000"/>
+                <a:tint val="40000"/>
+                <a:satMod val="350000"/>
               </a:schemeClr>
             </a:gs>
-            <a:gs pos="50000">
+            <a:gs pos="40000">
               <a:schemeClr val="phClr">
-                <a:tint val="98000"/>
-                <a:satMod val="130000"/>
-                <a:shade val="90000"/>
-                <a:lumMod val="103000"/>
+                <a:tint val="45000"/>
+                <a:shade val="99000"/>
+                <a:satMod val="350000"/>
               </a:schemeClr>
             </a:gs>
             <a:gs pos="100000">
               <a:schemeClr val="phClr">
-                <a:shade val="63000"/>
-                <a:satMod val="120000"/>
+                <a:shade val="20000"/>
+                <a:satMod val="255000"/>
               </a:schemeClr>
             </a:gs>
           </a:gsLst>
-          <a:lin ang="5400000" scaled="0"/>
+          <a:path path="circle">
+            <a:fillToRect l="50000" t="-80000" r="50000" b="180000"/>
+          </a:path>
+        </a:gradFill>
+        <a:gradFill rotWithShape="1">
+          <a:gsLst>
+            <a:gs pos="0">
+              <a:schemeClr val="phClr">
+                <a:tint val="80000"/>
+                <a:satMod val="300000"/>
+              </a:schemeClr>
+            </a:gs>
+            <a:gs pos="100000">
+              <a:schemeClr val="phClr">
+                <a:shade val="30000"/>
+                <a:satMod val="200000"/>
+              </a:schemeClr>
+            </a:gs>
+          </a:gsLst>
+          <a:path path="circle">
+            <a:fillToRect l="50000" t="50000" r="50000" b="50000"/>
+          </a:path>
         </a:gradFill>
       </a:bgFillStyleLst>
     </a:fmtScheme>
   </a:themeElements>
-  <a:objectDefaults/>
+  <a:objectDefaults>
+    <a:spDef>
+      <a:spPr/>
+      <a:bodyPr/>
+      <a:lstStyle/>
+      <a:style>
+        <a:lnRef idx="1">
+          <a:schemeClr val="accent1"/>
+        </a:lnRef>
+        <a:fillRef idx="3">
+          <a:schemeClr val="accent1"/>
+        </a:fillRef>
+        <a:effectRef idx="2">
+          <a:schemeClr val="accent1"/>
+        </a:effectRef>
+        <a:fontRef idx="minor">
+          <a:schemeClr val="lt1"/>
+        </a:fontRef>
+      </a:style>
+    </a:spDef>
+    <a:lnDef>
+      <a:spPr/>
+      <a:bodyPr/>
+      <a:lstStyle/>
+      <a:style>
+        <a:lnRef idx="2">
+          <a:schemeClr val="accent1"/>
+        </a:lnRef>
+        <a:fillRef idx="0">
+          <a:schemeClr val="accent1"/>
+        </a:fillRef>
+        <a:effectRef idx="1">
+          <a:schemeClr val="accent1"/>
+        </a:effectRef>
+        <a:fontRef idx="minor">
+          <a:schemeClr val="tx1"/>
+        </a:fontRef>
+      </a:style>
+    </a:lnDef>
+  </a:objectDefaults>
   <a:extraClrSchemeLst/>
-  <a:extLst>
-    <a:ext uri="{05A4C25C-085E-4340-85A3-A5531E510DB2}">
-      <thm15:themeFamily xmlns:thm15="http://schemas.microsoft.com/office/thememl/2012/main" name="Office Theme" id="{2E142A2C-CD16-42D6-873A-C26D2A0506FA}" vid="{1BDDFF52-6CD6-40A5-AB3C-68EB2F1E4D0A}"/>
-    </a:ext>
-  </a:extLst>
 </a:theme>
 </file>
</xml_diff>